<commit_message>
Apply RSC-Bench journal quality gate
</commit_message>
<xml_diff>
--- a/submission_files/results_in_engineering_upload_package/03_Manuscript.docx
+++ b/submission_files/results_in_engineering_upload_package/03_Manuscript.docx
@@ -12,7 +12,7 @@
           <w:b/>
           <w:sz w:val="32"/>
         </w:rPr>
-        <w:t>Robustness Benchmarking of Classical, Deep, and Quantum-Inspired AI for RF Signal Classification in Contested Spectrum Environments</w:t>
+        <w:t>RSC-Bench: Robustness Benchmarking of Classical, Deep, and Quantum-Inspired AI for RF Signal Classification in Contested Spectrum Environments</w:t>
       </w:r>
     </w:p>
     <w:p>
@@ -25,152 +25,12 @@
     </w:p>
     <w:p>
       <w:r>
-        <w:t>Automatic modulation classification is important for spectrum monitoring,</w:t>
+        <w:t>Automatic modulation classification is important for spectrum monitoring, secure wireless communications, cognitive radio, unmanned-system links, and defense-adjacent RF surveillance. However, many AI-based RF classifiers are reported mainly under nominal channel assumptions, while practical receivers must operate under low signal-to-noise ratio, narrowband and broadband jamming, carrier-frequency offset, multipath, and impulsive interference. This study develops RSC-Bench, a reproducible robustness-benchmarking protocol that compares classical machine-learning baselines, a compact raw-IQ convolutional neural network, a simulated quantum feature-map kernel classifier, and a classical PCA-RBF SVM ablation baseline. The novelty of this work is RSC-Bench, a reproducible robustness-evaluation protocol that couples clean RF modulation classification with stress-condition operators, same-feature quantum/classical kernel ablation, and complexity reporting on both synthetic IQ data and RadioML2016.10A. The protocol was evaluated on a controlled synthetic IQ dataset with 16,000 examples and eight modulation families, and validated on the public RadioML2016.10A benchmark containing 220,000 examples, 11 modulation classes, and SNR values from -20 to 18 dB. On the synthetic dataset, the raw-IQ CNN achieved the highest clean accuracy (0.654), followed by Random Forest (0.592), RBF-SVM (0.570), Logistic Regression (0.554), the simulated quantum kernel SVM (0.410), and the PCA-RBF ablation (0.408). On RadioML2016.10A, the raw-IQ CNN achieved the strongest clean accuracy (0.511) and macro-F1 (0.523). Robustness testing showed severe degradation under narrowband jamming, carrier-frequency offset, low SNR, multipath, and impulsive noise, demonstrating that clean accuracy alone is insufficient for RF model selection. The quantum-inspired kernel did not outperform the classical PCA-RBF ablation on the same compressed features, confirming that no quantum-feature-map advantage is supported by the evidence. The main engineering contribution is a transparent, reproducible robustness protocol with full public-benchmark validation, stress-condition failure analysis, ablation evidence, and computational complexity reporting.</w:t>
       </w:r>
     </w:p>
     <w:p>
       <w:r>
-        <w:t>secure wireless communications, cognitive radio, unmanned-system links, and</w:t>
-      </w:r>
-    </w:p>
-    <w:p>
-      <w:r>
-        <w:t>defense-adjacent RF surveillance. However, many AI-based RF classifiers are</w:t>
-      </w:r>
-    </w:p>
-    <w:p>
-      <w:r>
-        <w:t>reported mainly under nominal channel assumptions, while practical receivers</w:t>
-      </w:r>
-    </w:p>
-    <w:p>
-      <w:r>
-        <w:t>must operate under low signal-to-noise ratio, narrowband and broadband</w:t>
-      </w:r>
-    </w:p>
-    <w:p>
-      <w:r>
-        <w:t>jamming, carrier-frequency offset, multipath, and impulsive interference. This</w:t>
-      </w:r>
-    </w:p>
-    <w:p>
-      <w:r>
-        <w:t>study develops a reproducible robustness-benchmarking workflow that compares</w:t>
-      </w:r>
-    </w:p>
-    <w:p>
-      <w:r>
-        <w:t>classical machine-learning baselines, a compact raw-IQ convolutional neural</w:t>
-      </w:r>
-    </w:p>
-    <w:p>
-      <w:r>
-        <w:t>network, a simulated quantum feature-map kernel classifier, and a classical</w:t>
-      </w:r>
-    </w:p>
-    <w:p>
-      <w:r>
-        <w:t>PCA-RBF SVM ablation baseline. The workflow was evaluated on a controlled</w:t>
-      </w:r>
-    </w:p>
-    <w:p>
-      <w:r>
-        <w:t>synthetic IQ dataset with 16,000 examples and eight modulation families, and</w:t>
-      </w:r>
-    </w:p>
-    <w:p>
-      <w:r>
-        <w:t>validated on the public RadioML2016.10A benchmark containing 220,000 examples,</w:t>
-      </w:r>
-    </w:p>
-    <w:p>
-      <w:r>
-        <w:t>11 modulation classes, and SNR values from -20 to 18 dB. On the synthetic</w:t>
-      </w:r>
-    </w:p>
-    <w:p>
-      <w:r>
-        <w:t>dataset, the raw-IQ CNN achieved the highest clean accuracy (0.654), followed</w:t>
-      </w:r>
-    </w:p>
-    <w:p>
-      <w:r>
-        <w:t>by Random Forest (0.592), RBF-SVM (0.570), Logistic Regression (0.554), the</w:t>
-      </w:r>
-    </w:p>
-    <w:p>
-      <w:r>
-        <w:t>simulated quantum kernel SVM (0.410), and the PCA-RBF ablation (0.408). On</w:t>
-      </w:r>
-    </w:p>
-    <w:p>
-      <w:r>
-        <w:t>RadioML2016.10A, the raw-IQ CNN achieved the strongest clean accuracy (0.511)</w:t>
-      </w:r>
-    </w:p>
-    <w:p>
-      <w:r>
-        <w:t>and macro-F1 (0.523). Robustness testing showed severe degradation under</w:t>
-      </w:r>
-    </w:p>
-    <w:p>
-      <w:r>
-        <w:t>narrowband jamming, carrier-frequency offset, low SNR, multipath, and</w:t>
-      </w:r>
-    </w:p>
-    <w:p>
-      <w:r>
-        <w:t>impulsive noise, demonstrating that clean accuracy alone is insufficient for RF</w:t>
-      </w:r>
-    </w:p>
-    <w:p>
-      <w:r>
-        <w:t>model selection. The quantum-inspired kernel did not outperform the classical</w:t>
-      </w:r>
-    </w:p>
-    <w:p>
-      <w:r>
-        <w:t>PCA-RBF ablation on the same compressed features, confirming that no</w:t>
-      </w:r>
-    </w:p>
-    <w:p>
-      <w:r>
-        <w:t>quantum-feature-map advantage is supported by the evidence. The main</w:t>
-      </w:r>
-    </w:p>
-    <w:p>
-      <w:r>
-        <w:t>engineering contribution is a transparent, reproducible robustness protocol</w:t>
-      </w:r>
-    </w:p>
-    <w:p>
-      <w:r>
-        <w:t>with full public-benchmark validation, stress-condition failure analysis,</w:t>
-      </w:r>
-    </w:p>
-    <w:p>
-      <w:r>
-        <w:t>ablation evidence, and computational complexity reporting.</w:t>
-      </w:r>
-    </w:p>
-    <w:p>
-      <w:r>
-        <w:t>Keywords: automatic modulation classification; RF signal classification;</w:t>
-      </w:r>
-    </w:p>
-    <w:p>
-      <w:r>
-        <w:t>quantum-inspired machine learning; quantum kernel; robust artificial</w:t>
-      </w:r>
-    </w:p>
-    <w:p>
-      <w:r>
-        <w:t>intelligence; contested spectrum; jamming; low SNR; deep learning; cognitive</w:t>
-      </w:r>
-    </w:p>
-    <w:p>
-      <w:r>
-        <w:t>radio</w:t>
+        <w:t>Keywords: automatic modulation classification; RF signal classification; quantum-inspired machine learning; quantum kernel; robust artificial intelligence; contested spectrum; jamming; low SNR; deep learning; cognitive radio</w:t>
       </w:r>
     </w:p>
     <w:p>
@@ -183,152 +43,27 @@
     </w:p>
     <w:p>
       <w:r>
-        <w:t>Automatic modulation classification (AMC) aims to identify the modulation type</w:t>
+        <w:t>Automatic modulation classification (AMC) aims to identify the modulation type of an unknown received signal without requiring full transmitter-side metadata. It is a long-standing problem in signal processing and is relevant to adaptive communications, cognitive radio, interference monitoring, spectrum management, and RF surveillance. Classical AMC work relied heavily on likelihood-based methods, higher-order statistics, cumulants, cyclostationary features, and engineered time/frequency-domain descriptors [1, 2]. More recent work has shown that deep neural networks can learn useful representations directly from raw IQ samples or derived signal representations [3-13, 26-34].</w:t>
       </w:r>
     </w:p>
     <w:p>
       <w:r>
-        <w:t>of an unknown received signal without requiring full transmitter-side</w:t>
+        <w:t>Despite this progress, a gap remains between clean benchmark performance and operational robustness. Practical receivers may observe signals distorted by low SNR, frequency offset, fading, multipath, impulsive interference, and intentional jamming. Deep RF classifiers are also known to be vulnerable to adversarial perturbations and over-the-air attack settings [15-20]. For this reason, nominal clean accuracy is not sufficient for an engineering assessment of RF classifiers intended for degraded or contested spectrum environments.</w:t>
       </w:r>
     </w:p>
     <w:p>
       <w:r>
-        <w:t>metadata. It is a long-standing problem in signal processing and is relevant to</w:t>
+        <w:t>Quantum and quantum-inspired machine-learning methods have also attracted attention because quantum feature maps can be interpreted as high-dimensional kernel embeddings [21-25]. However, quantum advantage in practical classical-data classification problems is not automatic. Recent analyses show that classical models can remain competitive when enough data are available, and that quantum-kernel methods must be assessed against strong classical kernel baselines rather than weaker straw-man comparators [23-25].</w:t>
       </w:r>
     </w:p>
     <w:p>
       <w:r>
-        <w:t>adaptive communications, cognitive radio, interference monitoring, spectrum</w:t>
+        <w:t>This paper therefore does not present a new state-of-the-art AMC architecture or claim quantum advantage. Instead, it addresses a narrower but important engineering question: when classical ML, raw-IQ CNN, and simulated quantum-feature-map kernel classifiers are evaluated under the same clean and degraded RF conditions, what failure modes appear, and does the quantum-inspired embedding add measurable value beyond a classical kernel on the same reduced feature space?</w:t>
       </w:r>
     </w:p>
     <w:p>
       <w:r>
-        <w:t>management, and RF surveillance. Classical AMC work relied heavily on</w:t>
-      </w:r>
-    </w:p>
-    <w:p>
-      <w:r>
-        <w:t>likelihood-based methods, higher-order statistics, cumulants, cyclostationary</w:t>
-      </w:r>
-    </w:p>
-    <w:p>
-      <w:r>
-        <w:t>features, and engineered time/frequency-domain descriptors [1, 2]. More recent</w:t>
-      </w:r>
-    </w:p>
-    <w:p>
-      <w:r>
-        <w:t>work has shown that deep neural networks can learn useful representations</w:t>
-      </w:r>
-    </w:p>
-    <w:p>
-      <w:r>
-        <w:t>directly from raw IQ samples or derived signal representations [3-13].</w:t>
-      </w:r>
-    </w:p>
-    <w:p>
-      <w:r>
-        <w:t>Despite this progress, a gap remains between clean benchmark performance and</w:t>
-      </w:r>
-    </w:p>
-    <w:p>
-      <w:r>
-        <w:t>operational robustness. Practical receivers may observe signals distorted by</w:t>
-      </w:r>
-    </w:p>
-    <w:p>
-      <w:r>
-        <w:t>low SNR, frequency offset, fading, multipath, impulsive interference, and</w:t>
-      </w:r>
-    </w:p>
-    <w:p>
-      <w:r>
-        <w:t>intentional jamming. Deep RF classifiers are also known to be vulnerable to</w:t>
-      </w:r>
-    </w:p>
-    <w:p>
-      <w:r>
-        <w:t>adversarial perturbations and over-the-air attack settings [15-20]. For this</w:t>
-      </w:r>
-    </w:p>
-    <w:p>
-      <w:r>
-        <w:t>reason, nominal clean accuracy is not sufficient for an engineering assessment</w:t>
-      </w:r>
-    </w:p>
-    <w:p>
-      <w:r>
-        <w:t>of RF classifiers intended for degraded or contested spectrum environments.</w:t>
-      </w:r>
-    </w:p>
-    <w:p>
-      <w:r>
-        <w:t>Quantum and quantum-inspired machine-learning methods have also attracted</w:t>
-      </w:r>
-    </w:p>
-    <w:p>
-      <w:r>
-        <w:t>attention because quantum feature maps can be interpreted as high-dimensional</w:t>
-      </w:r>
-    </w:p>
-    <w:p>
-      <w:r>
-        <w:t>kernel embeddings [21-25]. However, quantum advantage in practical</w:t>
-      </w:r>
-    </w:p>
-    <w:p>
-      <w:r>
-        <w:t>classical-data classification problems is not automatic. Recent analyses show</w:t>
-      </w:r>
-    </w:p>
-    <w:p>
-      <w:r>
-        <w:t>that classical models can remain competitive when enough data are available,</w:t>
-      </w:r>
-    </w:p>
-    <w:p>
-      <w:r>
-        <w:t>and that quantum-kernel methods must be assessed against strong classical</w:t>
-      </w:r>
-    </w:p>
-    <w:p>
-      <w:r>
-        <w:t>kernel baselines rather than weaker straw-man comparators [23-25].</w:t>
-      </w:r>
-    </w:p>
-    <w:p>
-      <w:r>
-        <w:t>This paper therefore does not present a new state-of-the-art AMC architecture</w:t>
-      </w:r>
-    </w:p>
-    <w:p>
-      <w:r>
-        <w:t>or claim quantum advantage. Instead, it addresses a narrower but important</w:t>
-      </w:r>
-    </w:p>
-    <w:p>
-      <w:r>
-        <w:t>engineering question: when classical ML, raw-IQ CNN, and simulated</w:t>
-      </w:r>
-    </w:p>
-    <w:p>
-      <w:r>
-        <w:t>quantum-feature-map kernel classifiers are evaluated under the same clean and</w:t>
-      </w:r>
-    </w:p>
-    <w:p>
-      <w:r>
-        <w:t>degraded RF conditions, what failure modes appear, and does the</w:t>
-      </w:r>
-    </w:p>
-    <w:p>
-      <w:r>
-        <w:t>quantum-inspired embedding add measurable value beyond a classical kernel on</w:t>
-      </w:r>
-    </w:p>
-    <w:p>
-      <w:r>
-        <w:t>the same reduced feature space?</w:t>
+        <w:t>The novelty of this work is RSC-Bench, a reproducible robustness-evaluation protocol that couples clean RF modulation classification with stress-condition operators, same-feature quantum/classical kernel ablation, and complexity reporting on both synthetic IQ data and RadioML2016.10A.</w:t>
       </w:r>
     </w:p>
     <w:p>
@@ -349,72 +84,12 @@
     </w:p>
     <w:p>
       <w:r>
-        <w:t>Classical AMC surveys established the two main families of modulation</w:t>
+        <w:t>Classical AMC surveys established the two main families of modulation recognition methods: likelihood-based approaches and feature-based approaches [1]. Likelihood-based methods can approach optimality under well-specified models, but they are often computationally expensive and sensitive to assumptions about channel state, timing, phase, and SNR. Feature-based methods reduce complexity by using signal statistics, cumulants, instantaneous amplitude/phase features, and spectral features, but their performance depends on feature design and channel assumptions [1, 2].</w:t>
       </w:r>
     </w:p>
     <w:p>
       <w:r>
-        <w:t>recognition methods: likelihood-based approaches and feature-based approaches</w:t>
-      </w:r>
-    </w:p>
-    <w:p>
-      <w:r>
-        <w:t>[1]. Likelihood-based methods can approach optimality under well-specified</w:t>
-      </w:r>
-    </w:p>
-    <w:p>
-      <w:r>
-        <w:t>models, but they are often computationally expensive and sensitive to</w:t>
-      </w:r>
-    </w:p>
-    <w:p>
-      <w:r>
-        <w:t>assumptions about channel state, timing, phase, and SNR. Feature-based methods</w:t>
-      </w:r>
-    </w:p>
-    <w:p>
-      <w:r>
-        <w:t>reduce complexity by using signal statistics, cumulants, instantaneous</w:t>
-      </w:r>
-    </w:p>
-    <w:p>
-      <w:r>
-        <w:t>amplitude/phase features, and spectral features, but their performance depends</w:t>
-      </w:r>
-    </w:p>
-    <w:p>
-      <w:r>
-        <w:t>on feature design and channel assumptions [1, 2].</w:t>
-      </w:r>
-    </w:p>
-    <w:p>
-      <w:r>
-        <w:t>The RadioML family of datasets helped standardize deep-learning evaluation for</w:t>
-      </w:r>
-    </w:p>
-    <w:p>
-      <w:r>
-        <w:t>radio signal classification [3-5]. RadioML2016.10A remains widely used because</w:t>
-      </w:r>
-    </w:p>
-    <w:p>
-      <w:r>
-        <w:t>it provides labeled IQ sequences across multiple modulation types and SNR</w:t>
-      </w:r>
-    </w:p>
-    <w:p>
-      <w:r>
-        <w:t>levels. Later works extended the benchmark setting with deeper architectures,</w:t>
-      </w:r>
-    </w:p>
-    <w:p>
-      <w:r>
-        <w:t>larger datasets, distributed sensors, multistream fusion, and</w:t>
-      </w:r>
-    </w:p>
-    <w:p>
-      <w:r>
-        <w:t>resource-constrained models [5-13].</w:t>
+        <w:t>The RadioML family of datasets helped standardize deep-learning evaluation for radio signal classification [3-5]. RadioML2016.10A remains widely used because it provides labeled IQ sequences across multiple modulation types and SNR levels. Later works extended the benchmark setting with deeper architectures, larger datasets, distributed sensors, multistream fusion, resource-constrained models, attention mechanisms, transformer blocks, and joint signal-detection/classification settings [5-13, 26-34].</w:t>
       </w:r>
     </w:p>
     <w:p>
@@ -427,67 +102,12 @@
     </w:p>
     <w:p>
       <w:r>
-        <w:t>Convolutional modulation-recognition networks demonstrated that raw IQ</w:t>
+        <w:t>Convolutional modulation-recognition networks demonstrated that raw IQ sequences can be learned directly by CNNs [3]. Deep architectures were then expanded through residual networks, CLDNN-style models, recurrent models, feature-fusion systems, attention mechanisms, transformer encoders, and multi-domain input representations [4-13, 26-34]. These works are essential because they show that deep models can outperform many hand-crafted feature pipelines, especially at moderate and high SNR.</w:t>
       </w:r>
     </w:p>
     <w:p>
       <w:r>
-        <w:t>sequences can be learned directly by CNNs [3]. Deep architectures were then</w:t>
-      </w:r>
-    </w:p>
-    <w:p>
-      <w:r>
-        <w:t>expanded through residual networks, CLDNN-style models, recurrent models,</w:t>
-      </w:r>
-    </w:p>
-    <w:p>
-      <w:r>
-        <w:t>feature-fusion systems, and multi-domain input representations [4-13]. These</w:t>
-      </w:r>
-    </w:p>
-    <w:p>
-      <w:r>
-        <w:t>works are essential because they show that deep models can outperform many</w:t>
-      </w:r>
-    </w:p>
-    <w:p>
-      <w:r>
-        <w:t>hand-crafted feature pipelines, especially at moderate and high SNR.</w:t>
-      </w:r>
-    </w:p>
-    <w:p>
-      <w:r>
-        <w:t>However, deep AMC literature often emphasizes clean or SNR-stratified</w:t>
-      </w:r>
-    </w:p>
-    <w:p>
-      <w:r>
-        <w:t>performance rather than a broader stress-condition matrix. Some papers report</w:t>
-      </w:r>
-    </w:p>
-    <w:p>
-      <w:r>
-        <w:t>accuracy by SNR, but fewer provide a controlled comparison of clean accuracy,</w:t>
-      </w:r>
-    </w:p>
-    <w:p>
-      <w:r>
-        <w:t>low-SNR degradation, narrowband jamming, broadband jamming, carrier-frequency</w:t>
-      </w:r>
-    </w:p>
-    <w:p>
-      <w:r>
-        <w:t>offset, multipath, impulsive noise, ablation against a compressed-feature</w:t>
-      </w:r>
-    </w:p>
-    <w:p>
-      <w:r>
-        <w:t>kernel, and inference latency in one reproducible workflow. That gap motivates</w:t>
-      </w:r>
-    </w:p>
-    <w:p>
-      <w:r>
-        <w:t>the present benchmark design.</w:t>
+        <w:t>However, deep AMC literature often emphasizes clean or SNR-stratified performance rather than a broader stress-condition matrix. Some papers report accuracy by SNR, but fewer provide a controlled comparison of clean accuracy, low-SNR degradation, narrowband jamming, broadband jamming, carrier-frequency offset, multipath, impulsive noise, ablation against a compressed-feature kernel, and inference latency in one reproducible workflow. Recent Results in Engineering work has shown that RadioML-based AMR papers are expected to include explicit ablations, efficiency metrics, and low-SNR robustness claims [31]. RSC-Bench extends this style by making the robustness matrix itself the primary contribution and by including a same-feature quantum/classical kernel ablation to avoid unsupported claims.</w:t>
       </w:r>
     </w:p>
     <w:p>
@@ -500,67 +120,12 @@
     </w:p>
     <w:p>
       <w:r>
-        <w:t>Robustness is central to RF machine learning because the wireless channel and</w:t>
+        <w:t>Robustness is central to RF machine learning because the wireless channel and the attacker both act directly on the received waveform. Prior studies have shown that deep RF classifiers can be sensitive to adversarial perturbations, over-the-air attacks, channel-aware attacks, and wireless jamming [15-20]. Noise-mismatch work similarly shows that models trained under one impairment distribution may degrade sharply under another [14]. These studies support the need for a stress-test protocol that reports failure modes rather than only clean benchmark scores.</w:t>
       </w:r>
     </w:p>
     <w:p>
       <w:r>
-        <w:t>the attacker both act directly on the received waveform. Prior studies have</w:t>
-      </w:r>
-    </w:p>
-    <w:p>
-      <w:r>
-        <w:t>shown that deep RF classifiers can be sensitive to adversarial perturbations,</w:t>
-      </w:r>
-    </w:p>
-    <w:p>
-      <w:r>
-        <w:t>over-the-air attacks, channel-aware attacks, and wireless jamming [15-20].</w:t>
-      </w:r>
-    </w:p>
-    <w:p>
-      <w:r>
-        <w:t>Noise-mismatch work similarly shows that models trained under one impairment</w:t>
-      </w:r>
-    </w:p>
-    <w:p>
-      <w:r>
-        <w:t>distribution may degrade sharply under another [14]. These studies support the</w:t>
-      </w:r>
-    </w:p>
-    <w:p>
-      <w:r>
-        <w:t>need for a stress-test protocol that reports failure modes rather than only</w:t>
-      </w:r>
-    </w:p>
-    <w:p>
-      <w:r>
-        <w:t>clean benchmark scores.</w:t>
-      </w:r>
-    </w:p>
-    <w:p>
-      <w:r>
-        <w:t>The present paper is not an adversarial-attack paper in the strict white-box or</w:t>
-      </w:r>
-    </w:p>
-    <w:p>
-      <w:r>
-        <w:t>black-box optimization sense. Instead, it provides a reproducible engineering</w:t>
-      </w:r>
-    </w:p>
-    <w:p>
-      <w:r>
-        <w:t>stress benchmark using physically interpretable perturbations: low SNR,</w:t>
-      </w:r>
-    </w:p>
-    <w:p>
-      <w:r>
-        <w:t>narrowband jamming, broadband jamming, carrier-frequency offset, multipath,</w:t>
-      </w:r>
-    </w:p>
-    <w:p>
-      <w:r>
-        <w:t>and impulsive noise.</w:t>
+        <w:t>The present paper is not an adversarial-attack paper in the strict white-box or black-box optimization sense. Instead, it provides a reproducible engineering stress benchmark using physically interpretable perturbations: low SNR, narrowband jamming, broadband jamming, carrier-frequency offset, multipath, and impulsive noise.</w:t>
       </w:r>
     </w:p>
     <w:p>
@@ -573,72 +138,12 @@
     </w:p>
     <w:p>
       <w:r>
-        <w:t>Quantum feature maps can be viewed as nonlinear embeddings into Hilbert spaces,</w:t>
+        <w:t>Quantum feature maps can be viewed as nonlinear embeddings into Hilbert spaces, and quantum kernels can be used in a support-vector-machine framework [21, 22]. This perspective makes quantum-inspired kernels attractive as compact nonlinear classifiers for structured signal features. At the same time, quantum-machine-learning theory warns that advantage claims must be supported by careful comparisons against classical learners and classical kernels [23, 24]. In particular, if a quantum feature map is applied to low-dimensional classical features, a classical RBF kernel on the same features may perform similarly.</w:t>
       </w:r>
     </w:p>
     <w:p>
       <w:r>
-        <w:t>and quantum kernels can be used in a support-vector-machine framework [21,</w:t>
-      </w:r>
-    </w:p>
-    <w:p>
-      <w:r>
-        <w:t>22]. This perspective makes quantum-inspired kernels attractive as compact</w:t>
-      </w:r>
-    </w:p>
-    <w:p>
-      <w:r>
-        <w:t>nonlinear classifiers for structured signal features. At the same time,</w:t>
-      </w:r>
-    </w:p>
-    <w:p>
-      <w:r>
-        <w:t>quantum-machine-learning theory warns that advantage claims must be supported</w:t>
-      </w:r>
-    </w:p>
-    <w:p>
-      <w:r>
-        <w:t>by careful comparisons against classical learners and classical kernels [23,</w:t>
-      </w:r>
-    </w:p>
-    <w:p>
-      <w:r>
-        <w:t>24]. In particular, if a quantum feature map is applied to low-dimensional</w:t>
-      </w:r>
-    </w:p>
-    <w:p>
-      <w:r>
-        <w:t>classical features, a classical RBF kernel on the same features may perform</w:t>
-      </w:r>
-    </w:p>
-    <w:p>
-      <w:r>
-        <w:t>similarly.</w:t>
-      </w:r>
-    </w:p>
-    <w:p>
-      <w:r>
-        <w:t>The research gap addressed here is therefore not whether a quantum kernel can</w:t>
-      </w:r>
-    </w:p>
-    <w:p>
-      <w:r>
-        <w:t>be constructed, but whether a simulated quantum feature-map kernel improves RF</w:t>
-      </w:r>
-    </w:p>
-    <w:p>
-      <w:r>
-        <w:t>classification or robustness when compared directly to a PCA-RBF SVM on the</w:t>
-      </w:r>
-    </w:p>
-    <w:p>
-      <w:r>
-        <w:t>same compressed features. This ablation is included to prevent unsupported</w:t>
-      </w:r>
-    </w:p>
-    <w:p>
-      <w:r>
-        <w:t>quantum-advantage claims.</w:t>
+        <w:t>The research gap addressed here is therefore not whether a quantum kernel can be constructed, but whether a simulated quantum feature-map kernel improves RF classification or robustness when compared directly to a PCA-RBF SVM on the same compressed features. This ablation is included to prevent unsupported quantum-advantage claims.</w:t>
       </w:r>
     </w:p>
     <w:p>
@@ -651,17 +156,7 @@
     </w:p>
     <w:p>
       <w:r>
-        <w:t>Compared with prior work, this study is positioned as a reproducible</w:t>
-      </w:r>
-    </w:p>
-    <w:p>
-      <w:r>
-        <w:t>robustness benchmark rather than a single-model performance paper. The novelty</w:t>
-      </w:r>
-    </w:p>
-    <w:p>
-      <w:r>
-        <w:t>is the combination of:</w:t>
+        <w:t>Compared with prior work, this study is positioned as a reproducible robustness benchmark rather than a single-model performance paper. The novelty is the named RSC-Bench protocol and the combination of:</w:t>
       </w:r>
     </w:p>
     <w:p>
@@ -669,12 +164,7 @@
         <w:pStyle w:val="ListNumber"/>
       </w:pPr>
       <w:r>
-        <w:t>a stress-condition protocol covering six degraded RF conditions beyond</w:t>
-      </w:r>
-    </w:p>
-    <w:p>
-      <w:r>
-        <w:t>clean evaluation;</w:t>
+        <w:t>a stress-condition protocol covering six degraded RF conditions beyond clean evaluation;</w:t>
       </w:r>
     </w:p>
     <w:p>
@@ -682,12 +172,7 @@
         <w:pStyle w:val="ListNumber"/>
       </w:pPr>
       <w:r>
-        <w:t>side-by-side comparison of classical ML, raw-IQ CNN, simulated</w:t>
-      </w:r>
-    </w:p>
-    <w:p>
-      <w:r>
-        <w:t>quantum-feature-map kernel SVM, and a same-feature PCA-RBF ablation;</w:t>
+        <w:t>side-by-side comparison of classical ML, raw-IQ CNN, simulated quantum-feature-map kernel SVM, and a same-feature PCA-RBF ablation;</w:t>
       </w:r>
     </w:p>
     <w:p>
@@ -695,12 +180,7 @@
         <w:pStyle w:val="ListNumber"/>
       </w:pPr>
       <w:r>
-        <w:t>full RadioML2016.10A GPU validation in addition to a controlled synthetic</w:t>
-      </w:r>
-    </w:p>
-    <w:p>
-      <w:r>
-        <w:t>dataset;</w:t>
+        <w:t>full RadioML2016.10A GPU validation in addition to a controlled synthetic dataset;</w:t>
       </w:r>
     </w:p>
     <w:p>
@@ -716,12 +196,7 @@
         <w:pStyle w:val="ListNumber"/>
       </w:pPr>
       <w:r>
-        <w:t>complexity and inference-latency reporting to support engineering model</w:t>
-      </w:r>
-    </w:p>
-    <w:p>
-      <w:r>
-        <w:t>selection.</w:t>
+        <w:t>complexity and inference-latency reporting to support engineering model selection.</w:t>
       </w:r>
     </w:p>
     <w:p>
@@ -742,12 +217,7 @@
         <w:pStyle w:val="ListNumber"/>
       </w:pPr>
       <w:r>
-        <w:t>A reproducible RF/IQ signal-classification workflow covering synthetic IQ</w:t>
-      </w:r>
-    </w:p>
-    <w:p>
-      <w:r>
-        <w:t>data and the public RadioML2016.10A benchmark.</w:t>
+        <w:t>A reproducible RF/IQ signal-classification workflow covering synthetic IQ data and the public RadioML2016.10A benchmark.</w:t>
       </w:r>
     </w:p>
     <w:p>
@@ -755,12 +225,7 @@
         <w:pStyle w:val="ListNumber"/>
       </w:pPr>
       <w:r>
-        <w:t>A robustness protocol covering clean, low-SNR, narrowband-jam,</w:t>
-      </w:r>
-    </w:p>
-    <w:p>
-      <w:r>
-        <w:t>broadband-jam, frequency-offset, multipath, and impulsive-noise conditions.</w:t>
+        <w:t>A robustness protocol covering clean, low-SNR, narrowband-jam, broadband-jam, frequency-offset, multipath, and impulsive-noise conditions.</w:t>
       </w:r>
     </w:p>
     <w:p>
@@ -768,17 +233,7 @@
         <w:pStyle w:val="ListNumber"/>
       </w:pPr>
       <w:r>
-        <w:t>A transparent comparison of engineered-feature classical ML, raw-IQ CNN,</w:t>
-      </w:r>
-    </w:p>
-    <w:p>
-      <w:r>
-        <w:t>simulated quantum feature-map kernel SVM, and same-feature PCA-RBF SVM</w:t>
-      </w:r>
-    </w:p>
-    <w:p>
-      <w:r>
-        <w:t>ablation baselines.</w:t>
+        <w:t>A transparent comparison of engineered-feature classical ML, raw-IQ CNN, simulated quantum feature-map kernel SVM, and same-feature PCA-RBF SVM ablation baselines.</w:t>
       </w:r>
     </w:p>
     <w:p>
@@ -786,12 +241,7 @@
         <w:pStyle w:val="ListNumber"/>
       </w:pPr>
       <w:r>
-        <w:t>A direct test of the quantum-inspired feature map against a classical RBF</w:t>
-      </w:r>
-    </w:p>
-    <w:p>
-      <w:r>
-        <w:t>kernel on the same five-dimensional PCA representation.</w:t>
+        <w:t>A direct test of the quantum-inspired feature map against a classical RBF kernel on the same five-dimensional PCA representation.</w:t>
       </w:r>
     </w:p>
     <w:p>
@@ -799,12 +249,7 @@
         <w:pStyle w:val="ListNumber"/>
       </w:pPr>
       <w:r>
-        <w:t>A computational complexity and inference-latency analysis comparing</w:t>
-      </w:r>
-    </w:p>
-    <w:p>
-      <w:r>
-        <w:t>parameter counts and per-sample execution time.</w:t>
+        <w:t>A computational complexity and inference-latency analysis comparing parameter counts and per-sample execution time.</w:t>
       </w:r>
     </w:p>
     <w:p>
@@ -812,17 +257,7 @@
         <w:pStyle w:val="ListNumber"/>
       </w:pPr>
       <w:r>
-        <w:t>Full GPU benchmark results on RadioML2016.10A with clean performance,</w:t>
-      </w:r>
-    </w:p>
-    <w:p>
-      <w:r>
-        <w:t>stress-condition metrics, robustness-drop tables, and publication-quality</w:t>
-      </w:r>
-    </w:p>
-    <w:p>
-      <w:r>
-        <w:t>figures.</w:t>
+        <w:t>Full GPU benchmark results on RadioML2016.10A with clean performance, stress-condition metrics, robustness-drop tables, and publication-quality figures.</w:t>
       </w:r>
     </w:p>
     <w:p>
@@ -830,12 +265,7 @@
         <w:pStyle w:val="ListNumber"/>
       </w:pPr>
       <w:r>
-        <w:t>A cautious interpretation of the quantum-inspired component that avoids</w:t>
-      </w:r>
-    </w:p>
-    <w:p>
-      <w:r>
-        <w:t>unsupported quantum-advantage claims.</w:t>
+        <w:t>A cautious interpretation of the quantum-inspired component that avoids unsupported quantum-advantage claims.</w:t>
       </w:r>
     </w:p>
     <w:p>
@@ -869,77 +299,17 @@
     </w:p>
     <w:p>
       <w:r>
-        <w:t>where `I[n]` and `Q[n]` represent the in-phase and quadrature channels,</w:t>
+        <w:t>where `I[n]` and `Q[n]` represent the in-phase and quadrature channels, respectively, and `N = 128` is the sequence length. To reduce amplitude-scale differences, the signal vector is normalized to unit average power before feature extraction or CNN training.</w:t>
       </w:r>
     </w:p>
     <w:p>
       <w:r>
-        <w:t>respectively, and `N = 128` is the sequence length. To reduce amplitude-scale</w:t>
+        <w:t>The controlled synthetic dataset uses eight modulation families: BPSK, QPSK, 8PSK, QAM16, QAM64, BFSK, AM-DSB, and FM. The scaled synthetic run contains 2,000 samples per class, giving 16,000 total examples. The synthetic generator applies randomized phase rotation, carrier offset, optional multipath, and additive white Gaussian noise across SNR values of -6, 0, 6, 12, and 18 dB.</w:t>
       </w:r>
     </w:p>
     <w:p>
       <w:r>
-        <w:t>differences, the signal vector is normalized to unit average power before</w:t>
-      </w:r>
-    </w:p>
-    <w:p>
-      <w:r>
-        <w:t>feature extraction or CNN training.</w:t>
-      </w:r>
-    </w:p>
-    <w:p>
-      <w:r>
-        <w:t>The controlled synthetic dataset uses eight modulation families: BPSK, QPSK,</w:t>
-      </w:r>
-    </w:p>
-    <w:p>
-      <w:r>
-        <w:t>8PSK, QAM16, QAM64, BFSK, AM-DSB, and FM. The scaled synthetic run contains</w:t>
-      </w:r>
-    </w:p>
-    <w:p>
-      <w:r>
-        <w:t>2,000 samples per class, giving 16,000 total examples. The synthetic generator</w:t>
-      </w:r>
-    </w:p>
-    <w:p>
-      <w:r>
-        <w:t>applies randomized phase rotation, carrier offset, optional multipath, and</w:t>
-      </w:r>
-    </w:p>
-    <w:p>
-      <w:r>
-        <w:t>additive white Gaussian noise across SNR values of -6, 0, 6, 12, and 18 dB.</w:t>
-      </w:r>
-    </w:p>
-    <w:p>
-      <w:r>
-        <w:t>The public benchmark validation uses RadioML2016.10A. The converted clean NPZ</w:t>
-      </w:r>
-    </w:p>
-    <w:p>
-      <w:r>
-        <w:t>contains 220,000 examples, 11 modulation classes, and SNR values from -20 to</w:t>
-      </w:r>
-    </w:p>
-    <w:p>
-      <w:r>
-        <w:t>18 dB in 2 dB steps. The classes are 8PSK, AM-DSB, AM-SSB, BPSK, CPFSK, GFSK,</w:t>
-      </w:r>
-    </w:p>
-    <w:p>
-      <w:r>
-        <w:t>PAM4, QAM16, QAM64, QPSK, and WBFM. The raw RadioML file is not redistributed;</w:t>
-      </w:r>
-    </w:p>
-    <w:p>
-      <w:r>
-        <w:t>users must obtain it from the original dataset provider or validated public</w:t>
-      </w:r>
-    </w:p>
-    <w:p>
-      <w:r>
-        <w:t>mirror and comply with applicable license terms.</w:t>
+        <w:t>The public benchmark validation uses RadioML2016.10A. The converted clean NPZ contains 220,000 examples, 11 modulation classes, and SNR values from -20 to 18 dB in 2 dB steps. The classes are 8PSK, AM-DSB, AM-SSB, BPSK, CPFSK, GFSK, PAM4, QAM16, QAM64, QPSK, and WBFM. The raw RadioML file is not redistributed; users must obtain it from the original dataset provider or validated public mirror and comply with applicable license terms.</w:t>
       </w:r>
     </w:p>
     <w:p>
@@ -952,12 +322,7 @@
     </w:p>
     <w:p>
       <w:r>
-        <w:t>To evaluate classifier robustness in contested spectrum environments, a set of</w:t>
-      </w:r>
-    </w:p>
-    <w:p>
-      <w:r>
-        <w:t>repeatable signal stress operators is applied to each held-out test signal:</w:t>
+        <w:t>To evaluate classifier robustness in contested spectrum environments, a set of repeatable signal stress operators is applied to each held-out test signal:</w:t>
       </w:r>
     </w:p>
     <w:p>
@@ -966,12 +331,7 @@
         <w:ind w:left="360" w:hanging="216"/>
       </w:pPr>
       <w:r>
-        <w:t>Low SNR: additive complex Gaussian noise is applied to evaluate operation at</w:t>
-      </w:r>
-    </w:p>
-    <w:p>
-      <w:r>
-        <w:t>reduced signal-to-noise ratio.</w:t>
+        <w:t>Low SNR: additive complex Gaussian noise is applied to evaluate operation at reduced signal-to-noise ratio.</w:t>
       </w:r>
     </w:p>
     <w:p>
@@ -980,12 +340,7 @@
         <w:ind w:left="360" w:hanging="216"/>
       </w:pPr>
       <w:r>
-        <w:t>Narrowband jamming: a high-amplitude sinusoidal tone with randomized phase</w:t>
-      </w:r>
-    </w:p>
-    <w:p>
-      <w:r>
-        <w:t>and normalized frequency is added to the received IQ sequence.</w:t>
+        <w:t>Narrowband jamming: a high-amplitude sinusoidal tone with randomized phase and normalized frequency is added to the received IQ sequence.</w:t>
       </w:r>
     </w:p>
     <w:p>
@@ -994,12 +349,7 @@
         <w:ind w:left="360" w:hanging="216"/>
       </w:pPr>
       <w:r>
-        <w:t>Broadband jamming: high-power broadband noise is added to approximate</w:t>
-      </w:r>
-    </w:p>
-    <w:p>
-      <w:r>
-        <w:t>wideband interference.</w:t>
+        <w:t>Broadband jamming: high-power broadband noise is added to approximate wideband interference.</w:t>
       </w:r>
     </w:p>
     <w:p>
@@ -1008,12 +358,7 @@
         <w:ind w:left="360" w:hanging="216"/>
       </w:pPr>
       <w:r>
-        <w:t>Carrier-frequency offset: a progressive complex phase rotation is applied to</w:t>
-      </w:r>
-    </w:p>
-    <w:p>
-      <w:r>
-        <w:t>the IQ sequence.</w:t>
+        <w:t>Carrier-frequency offset: a progressive complex phase rotation is applied to the IQ sequence.</w:t>
       </w:r>
     </w:p>
     <w:p>
@@ -1022,12 +367,7 @@
         <w:ind w:left="360" w:hanging="216"/>
       </w:pPr>
       <w:r>
-        <w:t>Multipath fading: delayed and phase-rotated copies of the signal are added</w:t>
-      </w:r>
-    </w:p>
-    <w:p>
-      <w:r>
-        <w:t>with fixed sample delays and random path phases.</w:t>
+        <w:t>Multipath fading: delayed and phase-rotated copies of the signal are added with fixed sample delays and random path phases.</w:t>
       </w:r>
     </w:p>
     <w:p>
@@ -1041,17 +381,7 @@
     </w:p>
     <w:p>
       <w:r>
-        <w:t>These stressors are intentionally interpretable. They do not exhaust all</w:t>
-      </w:r>
-    </w:p>
-    <w:p>
-      <w:r>
-        <w:t>possible channels or attacks, but they provide repeatable degradation</w:t>
-      </w:r>
-    </w:p>
-    <w:p>
-      <w:r>
-        <w:t>conditions that can be audited and reproduced.</w:t>
+        <w:t>These stressors are intentionally interpretable. They do not exhaust all possible channels or attacks, but they provide repeatable degradation conditions that can be audited and reproduced.</w:t>
       </w:r>
     </w:p>
     <w:p>
@@ -1064,52 +394,12 @@
     </w:p>
     <w:p>
       <w:r>
-        <w:t>Classical baselines use engineered RF features derived from IQ statistics,</w:t>
+        <w:t>Classical baselines use a 15-dimensional engineered RF feature vector derived from IQ statistics, amplitude statistics, phase statistics, spectral centroid, spectral bandwidth, and FFT peak-to-mean ratio. The evaluated classical models are Logistic Regression, Random Forest, and RBF-SVM. Logistic Regression uses standardized features with maximum 1,500 iterations and regularization parameter `C = 2.0`; Random Forest uses 250 trees, random seed 2026, and minimum leaf size 2; RBF-SVM uses standardized features with `C = 8.0` and `gamma = scale`.</w:t>
       </w:r>
     </w:p>
     <w:p>
       <w:r>
-        <w:t>amplitude statistics, phase statistics, spectral centroid, spectral bandwidth,</w:t>
-      </w:r>
-    </w:p>
-    <w:p>
-      <w:r>
-        <w:t>and FFT peak-to-mean ratio. The evaluated classical models are Logistic</w:t>
-      </w:r>
-    </w:p>
-    <w:p>
-      <w:r>
-        <w:t>Regression, Random Forest, and RBF-SVM.</w:t>
-      </w:r>
-    </w:p>
-    <w:p>
-      <w:r>
-        <w:t>The deep-learning baseline is a compact one-dimensional convolutional neural</w:t>
-      </w:r>
-    </w:p>
-    <w:p>
-      <w:r>
-        <w:t>network trained directly on raw IQ samples. It uses three Conv1D blocks with</w:t>
-      </w:r>
-    </w:p>
-    <w:p>
-      <w:r>
-        <w:t>batch normalization, ReLU activations, pooling, adaptive average pooling,</w:t>
-      </w:r>
-    </w:p>
-    <w:p>
-      <w:r>
-        <w:t>dropout, and a linear classification head. In the full RadioML run, the CNN was</w:t>
-      </w:r>
-    </w:p>
-    <w:p>
-      <w:r>
-        <w:t>trained on CUDA for 40 epochs with batch size 512 and best-epoch restoration.</w:t>
-      </w:r>
-    </w:p>
-    <w:p>
-      <w:r>
-        <w:t>The final restored model came from epoch 18.</w:t>
+        <w:t>The deep-learning baseline is a compact one-dimensional convolutional neural network trained directly on raw IQ samples. It uses three Conv1D blocks with channel widths 32, 64, and 128; kernel sizes 7, 5, and 3; batch normalization; ReLU activations; pooling; adaptive average pooling; dropout 0.15; and a linear classification head. In the full RadioML run, the CNN was trained on CUDA for 40 epochs with batch size 512, AdamW optimization, learning rate 0.001, weight decay 0.0001, random seed 2026, and best-epoch restoration. The final restored model came from epoch 18.</w:t>
       </w:r>
     </w:p>
     <w:p>
@@ -1122,37 +412,7 @@
     </w:p>
     <w:p>
       <w:r>
-        <w:t>The quantum-inspired baseline is a simulated quantum feature-map kernel SVM. A</w:t>
-      </w:r>
-    </w:p>
-    <w:p>
-      <w:r>
-        <w:t>32-dimensional engineered statistical feature vector is standardized and</w:t>
-      </w:r>
-    </w:p>
-    <w:p>
-      <w:r>
-        <w:t>projected to five dimensions using principal component analysis (PCA). The</w:t>
-      </w:r>
-    </w:p>
-    <w:p>
-      <w:r>
-        <w:t>resulting five-dimensional vector is scaled to angular values and mapped to a</w:t>
-      </w:r>
-    </w:p>
-    <w:p>
-      <w:r>
-        <w:t>complex `2^5`-dimensional simulated statevector using single-qubit angle</w:t>
-      </w:r>
-    </w:p>
-    <w:p>
-      <w:r>
-        <w:t>features and pairwise phase interactions. The SVM is trained on a</w:t>
-      </w:r>
-    </w:p>
-    <w:p>
-      <w:r>
-        <w:t>fidelity-style precomputed kernel:</w:t>
+        <w:t>The quantum-inspired baseline is a simulated quantum feature-map kernel SVM. A 15-dimensional engineered statistical feature vector is standardized and projected to five dimensions using principal component analysis (PCA). The resulting five-dimensional vector is scaled to angular values in `[-pi, pi]` and mapped to a complex `2^5`-dimensional simulated statevector using single-qubit angle features and pairwise phase interactions with entanglement strength 0.35. The precomputed-kernel SVM uses `C = 4.0` and is trained on a fidelity-style precomputed kernel:</w:t>
       </w:r>
     </w:p>
     <w:p>
@@ -1165,42 +425,12 @@
     </w:p>
     <w:p>
       <w:r>
-        <w:t>This is a simulated quantum-inspired feature map, not a hardware</w:t>
+        <w:t>This is a simulated quantum-inspired feature map, not a hardware implementation and not a quantum-advantage claim.</w:t>
       </w:r>
     </w:p>
     <w:p>
       <w:r>
-        <w:t>implementation and not a quantum-advantage claim.</w:t>
-      </w:r>
-    </w:p>
-    <w:p>
-      <w:r>
-        <w:t>To isolate whether the quantum feature map contributes beyond a standard</w:t>
-      </w:r>
-    </w:p>
-    <w:p>
-      <w:r>
-        <w:t>kernel, a classical PCA-RBF SVM ablation baseline is trained on the identical</w:t>
-      </w:r>
-    </w:p>
-    <w:p>
-      <w:r>
-        <w:t>five-dimensional PCA features. If the quantum feature map adds meaningful</w:t>
-      </w:r>
-    </w:p>
-    <w:p>
-      <w:r>
-        <w:t>representational value, it should outperform this same-feature classical</w:t>
-      </w:r>
-    </w:p>
-    <w:p>
-      <w:r>
-        <w:t>kernel. If it does not, the quantum-inspired embedding should be reported as a</w:t>
-      </w:r>
-    </w:p>
-    <w:p>
-      <w:r>
-        <w:t>negative or neutral baseline rather than as a superior method.</w:t>
+        <w:t>To isolate whether the quantum feature map contributes beyond a standard kernel, a classical PCA-RBF SVM ablation baseline is trained on the identical five-dimensional PCA features. If the quantum feature map adds meaningful representational value, it should outperform this same-feature classical kernel. If it does not, the quantum-inspired embedding should be reported as a negative or neutral baseline rather than as a superior method.</w:t>
       </w:r>
     </w:p>
     <w:p>
@@ -1208,47 +438,159 @@
         <w:pStyle w:val="Heading2"/>
       </w:pPr>
       <w:r>
-        <w:t>4.5 Evaluation protocol</w:t>
+        <w:t>4.5 RSC-Bench protocol and formal pseudocode</w:t>
       </w:r>
     </w:p>
     <w:p>
       <w:r>
-        <w:t>All models use stratified held-out evaluation. Clean performance is measured</w:t>
+        <w:t>RSC-Bench is the named evaluation protocol used in this study. Its purpose is to prevent three common weaknesses in applied RFML papers: reporting clean accuracy without degradation evidence, comparing a quantum-inspired model only against weak baselines, and omitting computational cost.</w:t>
       </w:r>
     </w:p>
     <w:p>
       <w:r>
-        <w:t>using accuracy and macro F1. Robustness is measured by evaluating the trained</w:t>
+        <w:t>Algorithm 1. RSC-Bench robustness evaluation protocol.</w:t>
       </w:r>
     </w:p>
     <w:p>
       <w:r>
-        <w:t>model on held-out examples transformed by each stress condition and reporting</w:t>
+        <w:t>Input: clean dataset `D = {(x_i, y_i)}`, model set `M`, stress-operator set `S`, stratified split rule `pi`, metric set `G = {accuracy, macro-F1}`, feature extractor `phi`, and random seed `r`.</w:t>
       </w:r>
     </w:p>
     <w:p>
       <w:r>
-        <w:t>the percentage drop from clean accuracy and macro F1. The full RadioML run used</w:t>
+        <w:t>Output: clean metrics, stress metrics, robustness-drop table, same-feature kernel ablation table, and complexity table.</w:t>
+      </w:r>
+    </w:p>
+    <w:p>
+      <w:pPr>
+        <w:pStyle w:val="ListNumber"/>
+      </w:pPr>
+      <w:r>
+        <w:t>Normalize each IQ sequence `x_i` to unit average power.</w:t>
+      </w:r>
+    </w:p>
+    <w:p>
+      <w:pPr>
+        <w:pStyle w:val="ListNumber"/>
+      </w:pPr>
+      <w:r>
+        <w:t>Split `D` into stratified training and held-out test sets using `pi` and seed `r`.</w:t>
+      </w:r>
+    </w:p>
+    <w:p>
+      <w:pPr>
+        <w:pStyle w:val="ListNumber"/>
+      </w:pPr>
+      <w:r>
+        <w:t>For each model `m` in `M`, train `m` on the clean training set or its feature representation `phi(D_train)`.</w:t>
+      </w:r>
+    </w:p>
+    <w:p>
+      <w:pPr>
+        <w:pStyle w:val="ListNumber"/>
+      </w:pPr>
+      <w:r>
+        <w:t>Evaluate each trained model on the clean held-out test set and record all metrics in `G`.</w:t>
+      </w:r>
+    </w:p>
+    <w:p>
+      <w:pPr>
+        <w:pStyle w:val="ListNumber"/>
+      </w:pPr>
+      <w:r>
+        <w:t>For each stress operator `s` in `S`, transform the held-out test signals as `D_test_s = s(D_test)`.</w:t>
+      </w:r>
+    </w:p>
+    <w:p>
+      <w:pPr>
+        <w:pStyle w:val="ListNumber"/>
+      </w:pPr>
+      <w:r>
+        <w:t>Evaluate every trained model on `D_test_s` without retraining.</w:t>
+      </w:r>
+    </w:p>
+    <w:p>
+      <w:pPr>
+        <w:pStyle w:val="ListNumber"/>
+      </w:pPr>
+      <w:r>
+        <w:t>Compute robustness drop for each metric as `drop_s = 100 * (metric_clean - metric_s) / metric_clean`.</w:t>
+      </w:r>
+    </w:p>
+    <w:p>
+      <w:pPr>
+        <w:pStyle w:val="ListNumber"/>
+      </w:pPr>
+      <w:r>
+        <w:t>Train the simulated quantum feature-map kernel SVM on five PCA components of `phi(D_train)`.</w:t>
+      </w:r>
+    </w:p>
+    <w:p>
+      <w:pPr>
+        <w:pStyle w:val="ListNumber"/>
+      </w:pPr>
+      <w:r>
+        <w:t>Train a classical PCA-RBF SVM on the same five PCA components.</w:t>
+      </w:r>
+    </w:p>
+    <w:p>
+      <w:pPr>
+        <w:pStyle w:val="ListNumber"/>
+      </w:pPr>
+      <w:r>
+        <w:t>Compare the two kernel models on clean and stressed test subsets to test whether the quantum feature map adds value beyond the same compressed classical feature space.</w:t>
+      </w:r>
+    </w:p>
+    <w:p>
+      <w:pPr>
+        <w:pStyle w:val="ListNumber"/>
+      </w:pPr>
+      <w:r>
+        <w:t>Record training time, parameter or support-vector count, and per-sample inference latency for each model family.</w:t>
+      </w:r>
+    </w:p>
+    <w:p>
+      <w:pPr>
+        <w:pStyle w:val="ListNumber"/>
+      </w:pPr>
+      <w:r>
+        <w:t>Export reproducible CSV tables, figures, and repository commands.</w:t>
+      </w:r>
+    </w:p>
+    <w:p>
+      <w:pPr>
+        <w:pStyle w:val="Heading2"/>
+      </w:pPr>
+      <w:r>
+        <w:t>4.6 Computational complexity analysis</w:t>
       </w:r>
     </w:p>
     <w:p>
       <w:r>
-        <w:t>30,000 training and 10,000 test examples for the classical baselines, 80,000</w:t>
+        <w:t>Let `N_tr` and `N_te` denote the numbers of training and held-out test examples, `L = 128` denote IQ sequence length, `F = 15` denote the engineered feature dimension, `S` denote the number of stress operators, `M` denote the number of model families, `q = 5` denote the number of simulated qubits, and `n_q` denote the compact training subset used by the quantum-kernel model. Stress generation has time complexity `O(S N_te L)` and stores one transformed test array per stressor when materialized. Engineered-feature extraction has time complexity `O((N_tr + N_te) L log L)` because FFT-derived statistics are included, with feature memory `O((N_tr + N_te) F)`.</w:t>
       </w:r>
     </w:p>
     <w:p>
       <w:r>
-        <w:t>training and 20,000 test examples for the raw-IQ CNN, and a compact 120</w:t>
+        <w:t>For the classical models, Logistic Regression training scales approximately as `O(I N_tr F C)` for `I` optimizer iterations and `C` modulation classes, Random Forest training scales with the number of trees and split evaluations, and RBF-SVM training can scale between quadratic and cubic behavior in `N_tr` depending on the solver and support-vector count. The raw-IQ CNN has per-epoch training complexity proportional to the number of convolutional multiply-add operations across `N_tr` sequences and has inference complexity linear in the number of learned convolutional filters and sequence length.</w:t>
       </w:r>
     </w:p>
     <w:p>
       <w:r>
-        <w:t>train-per-class / 80 test-per-class configuration for the simulated quantum</w:t>
+        <w:t>For the simulated quantum feature-map kernel, state construction costs `O(n_q 2^q)`, training-kernel construction costs `O(n_q^2 2^q)`, and precomputed SVM training can scale up to `O(n_q^3)` in the worst case. The kernel matrix requires `O(n_q^2)` memory and the state table requires `O(n_q 2^q)` memory. These costs motivate the compact 120 train-per-class and 80 test-per-class RadioML configuration used for the quantum-kernel baseline.</w:t>
+      </w:r>
+    </w:p>
+    <w:p>
+      <w:pPr>
+        <w:pStyle w:val="Heading2"/>
+      </w:pPr>
+      <w:r>
+        <w:t>4.7 Evaluation protocol</w:t>
       </w:r>
     </w:p>
     <w:p>
       <w:r>
-        <w:t>feature-map kernel SVM.</w:t>
+        <w:t>All models use stratified held-out evaluation. Clean performance is measured using accuracy and macro F1. Robustness is measured by evaluating the trained model on held-out examples transformed by each stress condition and reporting the percentage drop from clean accuracy and macro F1. The full RadioML run used 30,000 training and 10,000 test examples for the classical baselines, 80,000 training and 20,000 test examples for the raw-IQ CNN, and a compact 120 train-per-class / 80 test-per-class configuration for the simulated quantum feature-map kernel SVM.</w:t>
       </w:r>
     </w:p>
     <w:p>
@@ -1269,17 +611,7 @@
     </w:p>
     <w:p>
       <w:r>
-        <w:t>The controlled synthetic dataset contains 2,000 samples per class and 16,000</w:t>
-      </w:r>
-    </w:p>
-    <w:p>
-      <w:r>
-        <w:t>total examples across eight modulation families and five SNR levels. The clean</w:t>
-      </w:r>
-    </w:p>
-    <w:p>
-      <w:r>
-        <w:t>classification table is provided in:</w:t>
+        <w:t>The controlled synthetic dataset contains 2,000 samples per class and 16,000 total examples across eight modulation families and five SNR levels. The clean classification table is provided in:</w:t>
       </w:r>
     </w:p>
     <w:p>
@@ -1292,52 +624,7 @@
     </w:p>
     <w:p>
       <w:r>
-        <w:t>With 2,000 samples per class, the raw-IQ CNN achieved the highest clean</w:t>
-      </w:r>
-    </w:p>
-    <w:p>
-      <w:r>
-        <w:t>held-out accuracy (0.654), followed by Random Forest (0.592), RBF-SVM (0.570),</w:t>
-      </w:r>
-    </w:p>
-    <w:p>
-      <w:r>
-        <w:t>Logistic Regression (0.554), the simulated quantum feature-map kernel SVM</w:t>
-      </w:r>
-    </w:p>
-    <w:p>
-      <w:r>
-        <w:t>(0.410), and the classical PCA-RBF SVM ablation baseline (0.408). The CNN</w:t>
-      </w:r>
-    </w:p>
-    <w:p>
-      <w:r>
-        <w:t>maintained the lowest mean stress-induced accuracy drop across the synthetic</w:t>
-      </w:r>
-    </w:p>
-    <w:p>
-      <w:r>
-        <w:t>robustness protocol, but remained vulnerable to narrowband jamming and</w:t>
-      </w:r>
-    </w:p>
-    <w:p>
-      <w:r>
-        <w:t>frequency offset. The PCA-RBF SVM and simulated quantum-kernel SVM achieved</w:t>
-      </w:r>
-    </w:p>
-    <w:p>
-      <w:r>
-        <w:t>statistically indistinguishable clean accuracy (0.408 vs. 0.410), showing that</w:t>
-      </w:r>
-    </w:p>
-    <w:p>
-      <w:r>
-        <w:t>the quantum feature map did not provide measurable benefit over a classical</w:t>
-      </w:r>
-    </w:p>
-    <w:p>
-      <w:r>
-        <w:t>kernel on the same compressed features.</w:t>
+        <w:t>With 2,000 samples per class, the raw-IQ CNN achieved the highest clean held-out accuracy (0.654), followed by Random Forest (0.592), RBF-SVM (0.570), Logistic Regression (0.554), the simulated quantum feature-map kernel SVM (0.410), and the classical PCA-RBF SVM ablation baseline (0.408). The CNN maintained the lowest mean stress-induced accuracy drop across the synthetic robustness protocol, but remained vulnerable to narrowband jamming and frequency offset. The PCA-RBF SVM and simulated quantum-kernel SVM achieved statistically indistinguishable clean accuracy (0.408 vs. 0.410), showing that the quantum feature map did not provide measurable benefit over a classical kernel on the same compressed features.</w:t>
       </w:r>
     </w:p>
     <w:p>
@@ -1350,12 +637,7 @@
     </w:p>
     <w:p>
       <w:r>
-        <w:t>The full GPU RadioML benchmark is the primary public-dataset evidence for this</w:t>
-      </w:r>
-    </w:p>
-    <w:p>
-      <w:r>
-        <w:t>study. The clean classification table is provided in:</w:t>
+        <w:t>The full GPU RadioML benchmark is the primary public-dataset evidence for this study. The clean classification table is provided in:</w:t>
       </w:r>
     </w:p>
     <w:p>
@@ -1368,32 +650,7 @@
     </w:p>
     <w:p>
       <w:r>
-        <w:t>On RadioML2016.10A, the raw-IQ CNN achieved the strongest clean performance</w:t>
-      </w:r>
-    </w:p>
-    <w:p>
-      <w:r>
-        <w:t>with 0.5114 accuracy and 0.5231 macro-F1 on 20,000 held-out examples. Random</w:t>
-      </w:r>
-    </w:p>
-    <w:p>
-      <w:r>
-        <w:t>Forest achieved 0.4846 accuracy and 0.4963 macro-F1; RBF-SVM achieved 0.4739</w:t>
-      </w:r>
-    </w:p>
-    <w:p>
-      <w:r>
-        <w:t>accuracy and 0.4887 macro-F1; Logistic Regression achieved 0.4344 accuracy and</w:t>
-      </w:r>
-    </w:p>
-    <w:p>
-      <w:r>
-        <w:t>0.4345 macro-F1. The simulated quantum feature-map kernel SVM achieved 0.3091</w:t>
-      </w:r>
-    </w:p>
-    <w:p>
-      <w:r>
-        <w:t>accuracy and 0.2953 macro-F1 on its compact evaluation subset.</w:t>
+        <w:t>On RadioML2016.10A, the raw-IQ CNN achieved the strongest clean performance with 0.5114 accuracy and 0.5231 macro-F1 on 20,000 held-out examples. Random Forest achieved 0.4846 accuracy and 0.4963 macro-F1; RBF-SVM achieved 0.4739 accuracy and 0.4887 macro-F1; Logistic Regression achieved 0.4344 accuracy and 0.4345 macro-F1. The simulated quantum feature-map kernel SVM achieved 0.3091 accuracy and 0.2953 macro-F1 on its compact evaluation subset.</w:t>
       </w:r>
     </w:p>
     <w:p>
@@ -1406,12 +663,7 @@
     </w:p>
     <w:p>
       <w:r>
-        <w:t>Robustness metrics and drop rates under degraded channel stressors are</w:t>
-      </w:r>
-    </w:p>
-    <w:p>
-      <w:r>
-        <w:t>provided in:</w:t>
+        <w:t>Robustness metrics and drop rates under degraded channel stressors are provided in:</w:t>
       </w:r>
     </w:p>
     <w:p>
@@ -1432,47 +684,7 @@
     </w:p>
     <w:p>
       <w:r>
-        <w:t>All models degraded under stress conditions. For the raw-IQ CNN, the largest</w:t>
-      </w:r>
-    </w:p>
-    <w:p>
-      <w:r>
-        <w:t>accuracy drops were observed under narrowband jamming (82.08 percent drop),</w:t>
-      </w:r>
-    </w:p>
-    <w:p>
-      <w:r>
-        <w:t>frequency offset (81.61 percent), and impulsive noise (80.28 percent). The CNN</w:t>
-      </w:r>
-    </w:p>
-    <w:p>
-      <w:r>
-        <w:t>was less affected by broadband jamming (33.64 percent drop) and low SNR (52.02</w:t>
-      </w:r>
-    </w:p>
-    <w:p>
-      <w:r>
-        <w:t>percent drop) relative to its most severe failure modes. Random Forest also</w:t>
-      </w:r>
-    </w:p>
-    <w:p>
-      <w:r>
-        <w:t>degraded sharply under narrowband jamming, while RBF-SVM collapsed toward</w:t>
-      </w:r>
-    </w:p>
-    <w:p>
-      <w:r>
-        <w:t>near-chance performance across all stressors. These results show that model</w:t>
-      </w:r>
-    </w:p>
-    <w:p>
-      <w:r>
-        <w:t>selection based only on clean-set accuracy would miss important deployment</w:t>
-      </w:r>
-    </w:p>
-    <w:p>
-      <w:r>
-        <w:t>risks.</w:t>
+        <w:t>All models degraded under stress conditions. For the raw-IQ CNN, the largest accuracy drops were observed under narrowband jamming (82.08 percent drop), frequency offset (81.61 percent), and impulsive noise (80.28 percent). The CNN was less affected by broadband jamming (33.64 percent drop) and low SNR (52.02 percent drop) relative to its most severe failure modes. Random Forest also degraded sharply under narrowband jamming, while RBF-SVM collapsed toward near-chance performance across all stressors. These results show that model selection based only on clean-set accuracy would miss important deployment risks.</w:t>
       </w:r>
     </w:p>
     <w:p>
@@ -1485,42 +697,7 @@
     </w:p>
     <w:p>
       <w:r>
-        <w:t>The simulated quantum feature-map kernel baseline did not outperform the</w:t>
-      </w:r>
-    </w:p>
-    <w:p>
-      <w:r>
-        <w:t>classical or CNN baselines. Its clean RadioML accuracy was 0.3091, and stress</w:t>
-      </w:r>
-    </w:p>
-    <w:p>
-      <w:r>
-        <w:t>conditions reduced performance toward near-chance levels. On the 2,000-sample</w:t>
-      </w:r>
-    </w:p>
-    <w:p>
-      <w:r>
-        <w:t>synthetic dataset, the classical PCA-RBF SVM achieved 0.408 clean accuracy</w:t>
-      </w:r>
-    </w:p>
-    <w:p>
-      <w:r>
-        <w:t>compared with 0.410 for the quantum kernel SVM, a difference within practical</w:t>
-      </w:r>
-    </w:p>
-    <w:p>
-      <w:r>
-        <w:t>noise. This ablation indicates that the simulated quantum circuit does not</w:t>
-      </w:r>
-    </w:p>
-    <w:p>
-      <w:r>
-        <w:t>confer a classification or robustness advantage over a standard kernel method</w:t>
-      </w:r>
-    </w:p>
-    <w:p>
-      <w:r>
-        <w:t>operating on the same five-dimensional PCA feature space.</w:t>
+        <w:t>The simulated quantum feature-map kernel baseline did not outperform the classical or CNN baselines. Its clean RadioML accuracy was 0.3091, and stress conditions reduced performance toward near-chance levels. On the 2,000-sample synthetic dataset, the classical PCA-RBF SVM achieved 0.408 clean accuracy compared with 0.410 for the quantum kernel SVM, a difference within practical noise. This ablation indicates that the simulated quantum circuit does not confer a classification or robustness advantage over a standard kernel method operating on the same five-dimensional PCA feature space.</w:t>
       </w:r>
     </w:p>
     <w:p>
@@ -1546,42 +723,7 @@
     </w:p>
     <w:p>
       <w:r>
-        <w:t>The raw-IQ CNN required the longest training time among the lightweight models</w:t>
-      </w:r>
-    </w:p>
-    <w:p>
-      <w:r>
-        <w:t>in the synthetic run, but achieved fast inference at 0.155 ms per sample.</w:t>
-      </w:r>
-    </w:p>
-    <w:p>
-      <w:r>
-        <w:t>Logistic Regression was the most lightweight model. The simulated</w:t>
-      </w:r>
-    </w:p>
-    <w:p>
-      <w:r>
-        <w:t>quantum-kernel SVM incurred higher inference latency than the PCA-RBF SVM due</w:t>
-      </w:r>
-    </w:p>
-    <w:p>
-      <w:r>
-        <w:t>to statevector computation overhead, while offering no compensating accuracy</w:t>
-      </w:r>
-    </w:p>
-    <w:p>
-      <w:r>
-        <w:t>benefit. This cost-benefit analysis further supports the conclusion that the</w:t>
-      </w:r>
-    </w:p>
-    <w:p>
-      <w:r>
-        <w:t>quantum-inspired kernel should be treated as a transparent comparator rather</w:t>
-      </w:r>
-    </w:p>
-    <w:p>
-      <w:r>
-        <w:t>than as a deployable advantage.</w:t>
+        <w:t>The raw-IQ CNN required the longest training time among the lightweight models in the synthetic run, but achieved fast inference at 0.155 ms per sample. Logistic Regression was the most lightweight model. The simulated quantum-kernel SVM incurred higher inference latency than the PCA-RBF SVM due to statevector computation overhead, while offering no compensating accuracy benefit. This cost-benefit analysis further supports the conclusion that the quantum-inspired kernel should be treated as a transparent comparator rather than as a deployable advantage.</w:t>
       </w:r>
     </w:p>
     <w:p>
@@ -1594,127 +736,22 @@
     </w:p>
     <w:p>
       <w:r>
-        <w:t>The full public benchmark supports the central engineering premise: clean</w:t>
+        <w:t>The full public benchmark supports the central engineering premise: clean classification accuracy is insufficient for RF model evaluation. A model may rank well under clean conditions while failing under a particular stressor. The raw-IQ CNN produced the best clean RadioML result, yet it degraded sharply under narrowband jamming and carrier-frequency offset. Classical models also showed stress-specific collapse, especially under jamming and low-SNR variants.</w:t>
       </w:r>
     </w:p>
     <w:p>
       <w:r>
-        <w:t>classification accuracy is insufficient for RF model evaluation. A model may</w:t>
+        <w:t>The sensitivity of the raw-IQ CNN to carrier-frequency offset is explainable: CFO introduces progressive phase rotation over time, which can invalidate the local temporal patterns learned by standard one-dimensional convolutional filters. Narrowband jamming introduces a high-energy localized tone that can dominate the received waveform and contaminate learned filters unless explicit spectral filtering, augmentation, or channel-compensation strategies are used.</w:t>
       </w:r>
     </w:p>
     <w:p>
       <w:r>
-        <w:t>rank well under clean conditions while failing under a particular stressor. The</w:t>
+        <w:t>The gap between clean and degraded performance is important for contested spectrum applications. Robust RF classifiers should be reported with both nominal and stress-condition metrics, including the specific perturbations that cause failure. The robustness-drop tables provide a compact way to compare models under this requirement.</w:t>
       </w:r>
     </w:p>
     <w:p>
       <w:r>
-        <w:t>raw-IQ CNN produced the best clean RadioML result, yet it degraded sharply</w:t>
-      </w:r>
-    </w:p>
-    <w:p>
-      <w:r>
-        <w:t>under narrowband jamming and carrier-frequency offset. Classical models also</w:t>
-      </w:r>
-    </w:p>
-    <w:p>
-      <w:r>
-        <w:t>showed stress-specific collapse, especially under jamming and low-SNR variants.</w:t>
-      </w:r>
-    </w:p>
-    <w:p>
-      <w:r>
-        <w:t>The sensitivity of the raw-IQ CNN to carrier-frequency offset is explainable:</w:t>
-      </w:r>
-    </w:p>
-    <w:p>
-      <w:r>
-        <w:t>CFO introduces progressive phase rotation over time, which can invalidate the</w:t>
-      </w:r>
-    </w:p>
-    <w:p>
-      <w:r>
-        <w:t>local temporal patterns learned by standard one-dimensional convolutional</w:t>
-      </w:r>
-    </w:p>
-    <w:p>
-      <w:r>
-        <w:t>filters. Narrowband jamming introduces a high-energy localized tone that can</w:t>
-      </w:r>
-    </w:p>
-    <w:p>
-      <w:r>
-        <w:t>dominate the received waveform and contaminate learned filters unless explicit</w:t>
-      </w:r>
-    </w:p>
-    <w:p>
-      <w:r>
-        <w:t>spectral filtering, augmentation, or channel-compensation strategies are used.</w:t>
-      </w:r>
-    </w:p>
-    <w:p>
-      <w:r>
-        <w:t>The gap between clean and degraded performance is important for contested</w:t>
-      </w:r>
-    </w:p>
-    <w:p>
-      <w:r>
-        <w:t>spectrum applications. Robust RF classifiers should be reported with both</w:t>
-      </w:r>
-    </w:p>
-    <w:p>
-      <w:r>
-        <w:t>nominal and stress-condition metrics, including the specific perturbations that</w:t>
-      </w:r>
-    </w:p>
-    <w:p>
-      <w:r>
-        <w:t>cause failure. The robustness-drop tables provide a compact way to compare</w:t>
-      </w:r>
-    </w:p>
-    <w:p>
-      <w:r>
-        <w:t>models under this requirement.</w:t>
-      </w:r>
-    </w:p>
-    <w:p>
-      <w:r>
-        <w:t>The quantum-inspired component should be interpreted carefully. The results do</w:t>
-      </w:r>
-    </w:p>
-    <w:p>
-      <w:r>
-        <w:t>not justify claims of quantum superiority. Instead, they show how a simulated</w:t>
-      </w:r>
-    </w:p>
-    <w:p>
-      <w:r>
-        <w:t>quantum feature-map kernel can be included transparently in an engineering</w:t>
-      </w:r>
-    </w:p>
-    <w:p>
-      <w:r>
-        <w:t>benchmark and compared against practical alternatives. The classical PCA-RBF</w:t>
-      </w:r>
-    </w:p>
-    <w:p>
-      <w:r>
-        <w:t>SVM ablation provides the strongest evidence for this conclusion: when both</w:t>
-      </w:r>
-    </w:p>
-    <w:p>
-      <w:r>
-        <w:t>classifiers receive identical five-dimensional PCA features, the quantum</w:t>
-      </w:r>
-    </w:p>
-    <w:p>
-      <w:r>
-        <w:t>feature map's exponential Hilbert-space embedding does not improve accuracy or</w:t>
-      </w:r>
-    </w:p>
-    <w:p>
-      <w:r>
-        <w:t>robustness over a standard RBF kernel.</w:t>
+        <w:t>The quantum-inspired component should be interpreted carefully. The results do not justify claims of quantum superiority. Instead, they show how a simulated quantum feature-map kernel can be included transparently in an engineering benchmark and compared against practical alternatives. The classical PCA-RBF SVM ablation provides the strongest evidence for this conclusion: when both classifiers receive identical five-dimensional PCA features, the quantum feature map's exponential Hilbert-space embedding does not improve accuracy or robustness over a standard RBF kernel.</w:t>
       </w:r>
     </w:p>
     <w:p>
@@ -1727,52 +764,12 @@
     </w:p>
     <w:p>
       <w:r>
-        <w:t>This study is simulation and public-benchmark based. It does not use live RF</w:t>
+        <w:t>This study is simulation and public-benchmark based. It does not use live RF captures, hardware-in-the-loop evaluation, over-the-air adversarial testing, or classified defense data. RadioML2016.10A is a useful public benchmark, but it does not represent every operational RF channel or emitter environment. The stress transformations are controlled and reproducible rather than exhaustive. The simulated quantum feature-map kernel is evaluated on a compact subset because kernel methods scale poorly with the number of training examples.</w:t>
       </w:r>
     </w:p>
     <w:p>
       <w:r>
-        <w:t>captures, hardware-in-the-loop evaluation, over-the-air adversarial testing, or</w:t>
-      </w:r>
-    </w:p>
-    <w:p>
-      <w:r>
-        <w:t>classified defense data. RadioML2016.10A is a useful public benchmark, but it</w:t>
-      </w:r>
-    </w:p>
-    <w:p>
-      <w:r>
-        <w:t>does not represent every operational RF channel or emitter environment. The</w:t>
-      </w:r>
-    </w:p>
-    <w:p>
-      <w:r>
-        <w:t>stress transformations are controlled and reproducible rather than exhaustive.</w:t>
-      </w:r>
-    </w:p>
-    <w:p>
-      <w:r>
-        <w:t>The simulated quantum feature-map kernel is evaluated on a compact subset</w:t>
-      </w:r>
-    </w:p>
-    <w:p>
-      <w:r>
-        <w:t>because kernel methods scale poorly with the number of training examples.</w:t>
-      </w:r>
-    </w:p>
-    <w:p>
-      <w:r>
-        <w:t>The paper therefore should be interpreted as a reproducible engineering</w:t>
-      </w:r>
-    </w:p>
-    <w:p>
-      <w:r>
-        <w:t>benchmark and robustness audit, not as a claim of operational deployment</w:t>
-      </w:r>
-    </w:p>
-    <w:p>
-      <w:r>
-        <w:t>readiness or quantum advantage.</w:t>
+        <w:t>The paper therefore should be interpreted as a reproducible engineering benchmark and robustness audit, not as a claim of operational deployment readiness or quantum advantage.</w:t>
       </w:r>
     </w:p>
     <w:p>
@@ -1785,47 +782,20 @@
     </w:p>
     <w:p>
       <w:r>
-        <w:t>This work establishes a reproducible evaluation workflow for robustness-aware</w:t>
+        <w:t>This work establishes RSC-Bench, a reproducible evaluation protocol for robustness-aware RF signal classification under degraded spectrum conditions. The full RadioML2016.10A GPU benchmark shows that the raw-IQ CNN has the strongest clean performance among the tested models, but also reveals large stress-condition failure modes. Classical models and the simulated quantum-inspired kernel provide useful comparators, while the quantum-inspired result is best framed as a transparent baseline rather than a quantum-advantage result. The main engineering contribution is a reproducible robustness protocol and evidence package for AI-based RF classification in contested-spectrum environments.</w:t>
+      </w:r>
+    </w:p>
+    <w:p>
+      <w:pPr>
+        <w:pStyle w:val="Heading1"/>
+      </w:pPr>
+      <w:r>
+        <w:t>9. Submission Integrity And AI-Assisted Writing Disclosure</w:t>
       </w:r>
     </w:p>
     <w:p>
       <w:r>
-        <w:t>RF signal classification under degraded spectrum conditions. The full</w:t>
-      </w:r>
-    </w:p>
-    <w:p>
-      <w:r>
-        <w:t>RadioML2016.10A GPU benchmark shows that the raw-IQ CNN has the strongest clean</w:t>
-      </w:r>
-    </w:p>
-    <w:p>
-      <w:r>
-        <w:t>performance among the tested models, but also reveals large stress-condition</w:t>
-      </w:r>
-    </w:p>
-    <w:p>
-      <w:r>
-        <w:t>failure modes. Classical models and the simulated quantum-inspired kernel</w:t>
-      </w:r>
-    </w:p>
-    <w:p>
-      <w:r>
-        <w:t>provide useful comparators, while the quantum-inspired result is best framed as</w:t>
-      </w:r>
-    </w:p>
-    <w:p>
-      <w:r>
-        <w:t>a transparent baseline rather than a quantum-advantage result. The main</w:t>
-      </w:r>
-    </w:p>
-    <w:p>
-      <w:r>
-        <w:t>engineering contribution is a reproducible robustness protocol and evidence</w:t>
-      </w:r>
-    </w:p>
-    <w:p>
-      <w:r>
-        <w:t>package for AI-based RF classification in contested-spectrum environments.</w:t>
+        <w:t>All numerical results reported in the manuscript are derived from the CSV tables and figures generated by the repository scripts. No unresolved DOIs, unresolved funding statements, unresolved ethics statements, or unsupported quantum-advantage claims are intentionally retained. The raw RadioML2016.10A dataset is not redistributed; the manuscript reports derived metrics and provides commands for independent reproduction by users with lawful dataset access. AI-assisted drafting and code-generation tools were used for editorial drafting, code scaffolding, and consistency checking; the author reviewed, executed, and verified the analyses, metrics, and final text.</w:t>
       </w:r>
     </w:p>
     <w:p>
@@ -1962,6 +932,51 @@
       </w:r>
     </w:p>
     <w:p>
+      <w:r>
+        <w:t>26. T. Huynh-The, C. H. Hua, Q. V. Pham, and D. S. Kim, "MCNet: An efficient CNN architecture for robust automatic modulation classification," IEEE Communications Letters, vol. 24, no. 4, pp. 811-815, 2020, doi: 10.1109/LCOMM.2020.2968030.</w:t>
+      </w:r>
+    </w:p>
+    <w:p>
+      <w:r>
+        <w:t>27. A. P. Hermawan, R. R. Ginanjar, D. S. Kim, and J. M. Lee, "CNN-based automatic modulation classification for beyond 5G communications," IEEE Communications Letters, vol. 24, no. 5, pp. 1038-1041, 2020, doi: 10.1109/LCOMM.2020.2970922.</w:t>
+      </w:r>
+    </w:p>
+    <w:p>
+      <w:r>
+        <w:t>28. N. Wang, Y. Liu, L. Ma, Y. Yang, and H. Wang, "Multidimensional CNN-LSTM network for automatic modulation classification," Electronics, vol. 10, no. 14, 1649, 2021, doi: 10.3390/electronics10141649.</w:t>
+      </w:r>
+    </w:p>
+    <w:p>
+      <w:r>
+        <w:t>29. L. Weng, Y. He, J. Peng, J. Zheng, and X. Li, "Deep cascading network architecture for robust automatic modulation classification," Neurocomputing, vol. 455, pp. 308-324, 2021, doi: 10.1016/j.neucom.2021.05.010.</w:t>
+      </w:r>
+    </w:p>
+    <w:p>
+      <w:r>
+        <w:t>30. Z. Lyu, Y. Wang, W. Li, L. Guo, J. Yang, J. Sun, M. Liu, and G. Gui, "Robust automatic modulation classification based on convolutional and recurrent fusion network," Physical Communication, vol. 43, 101213, 2020, doi: 10.1016/j.phycom.2020.101213.</w:t>
+      </w:r>
+    </w:p>
+    <w:p>
+      <w:r>
+        <w:t>31. N. El-Haryqy, A. Kharbouche, H. Ouamna, Z. Madini, and Y. Zouine, "Improved automatic modulation recognition using deep learning with additive attention," Results in Engineering, vol. 26, 104783, 2025, doi: 10.1016/j.rineng.2025.104783.</w:t>
+      </w:r>
+    </w:p>
+    <w:p>
+      <w:r>
+        <w:t>32. A. Kumar, M. S. Chaudhari, and S. Majhi, "Automatic modulation classification for OFDM systems using bi-stream and attention-based CNN-LSTM model," IEEE Communications Letters, 2024, doi: 10.1109/LCOMM.2023.3348512.</w:t>
+      </w:r>
+    </w:p>
+    <w:p>
+      <w:r>
+        <w:t>33. C. Zhao, J. Chen, X. Huang, and Z. Wu, "A cross-scale embedding based fusion transformer for automatic modulation recognition," IEEE Communications Letters, vol. 28, no. 1, pp. 68-72, 2024, doi: 10.1109/LCOMM.2023.3331265.</w:t>
+      </w:r>
+    </w:p>
+    <w:p>
+      <w:r>
+        <w:t>34. H. Xing, X. Zhang, S. Chang, J. Ren, Z. Zhang, J. Xu, and S. Cui, "Joint signal detection and automatic modulation classification via deep learning," IEEE Transactions on Wireless Communications, vol. 23, no. 11, pp. 17129-17142, 2024, doi: 10.1109/TWC.2024.3450972.</w:t>
+      </w:r>
+    </w:p>
+    <w:p>
       <w:pPr>
         <w:sectPr>
           <w:pgSz w:w="12240" w:h="15840"/>
@@ -2008,6 +1023,19 @@
     <w:p>
       <w:r>
         <w:t>The author declares no known competing financial interests or personal relationships.</w:t>
+      </w:r>
+    </w:p>
+    <w:p>
+      <w:pPr>
+        <w:pStyle w:val="Heading1"/>
+      </w:pPr>
+      <w:r>
+        <w:t>AI-Assisted Writing Disclosure</w:t>
+      </w:r>
+    </w:p>
+    <w:p>
+      <w:r>
+        <w:t>AI-assisted drafting and code-generation tools were used for editorial drafting, code scaffolding, and consistency checking. The author reviewed, executed, and verified the analyses, metrics, and final text.</w:t>
       </w:r>
     </w:p>
     <w:p>

</xml_diff>

<commit_message>
Refresh manuscript with recent references
</commit_message>
<xml_diff>
--- a/submission_files/results_in_engineering_upload_package/03_Manuscript.docx
+++ b/submission_files/results_in_engineering_upload_package/03_Manuscript.docx
@@ -43,17 +43,17 @@
     </w:p>
     <w:p>
       <w:r>
-        <w:t>Automatic modulation classification (AMC) aims to identify the modulation type of an unknown received signal without requiring full transmitter-side metadata. It is a long-standing problem in signal processing and is relevant to adaptive communications, cognitive radio, interference monitoring, spectrum management, and RF surveillance. Classical AMC work relied heavily on likelihood-based methods, higher-order statistics, cumulants, cyclostationary features, and engineered time/frequency-domain descriptors [1, 2]. More recent work has shown that deep neural networks can learn useful representations directly from raw IQ samples or derived signal representations [3-13, 26-34].</w:t>
+        <w:t>Automatic modulation classification (AMC) aims to identify the modulation type of an unknown received signal without requiring full transmitter-side metadata. It is a long-standing problem in signal processing and is relevant to adaptive communications, cognitive radio, interference monitoring, spectrum management, and RF surveillance. Recent AMC surveys still identify likelihood-based methods, higher-order statistics, cumulants, cyclostationary features, and engineered time/frequency-domain descriptors as important classical baselines, while also showing the rapid movement toward learned IQ representations [1, 2]. Recent deep-learning work has shown that neural networks can learn useful representations directly from raw IQ samples or derived signal representations [3-32].</w:t>
       </w:r>
     </w:p>
     <w:p>
       <w:r>
-        <w:t>Despite this progress, a gap remains between clean benchmark performance and operational robustness. Practical receivers may observe signals distorted by low SNR, frequency offset, fading, multipath, impulsive interference, and intentional jamming. Deep RF classifiers are also known to be vulnerable to adversarial perturbations and over-the-air attack settings [15-20]. For this reason, nominal clean accuracy is not sufficient for an engineering assessment of RF classifiers intended for degraded or contested spectrum environments.</w:t>
+        <w:t>Despite this progress, a gap remains between clean benchmark performance and operational robustness. Practical receivers may observe signals distorted by low SNR, frequency offset, fading, multipath, impulsive interference, and intentional jamming. Deep RF classifiers are also known to be vulnerable to adversarial perturbations, adversarial RF examples, and channel-aware attack settings [19, 31, 32, 36, 37]. For this reason, nominal clean accuracy is not sufficient for an engineering assessment of RF classifiers intended for degraded or contested spectrum environments.</w:t>
       </w:r>
     </w:p>
     <w:p>
       <w:r>
-        <w:t>Quantum and quantum-inspired machine-learning methods have also attracted attention because quantum feature maps can be interpreted as high-dimensional kernel embeddings [21-25]. However, quantum advantage in practical classical-data classification problems is not automatic. Recent analyses show that classical models can remain competitive when enough data are available, and that quantum-kernel methods must be assessed against strong classical kernel baselines rather than weaker straw-man comparators [23-25].</w:t>
+        <w:t>Quantum and quantum-inspired machine-learning methods have also attracted attention because quantum feature maps can be interpreted as high-dimensional kernel embeddings and because quantum processors have begun to be explored for analog RF/microwave signal classification [33-38]. However, quantum advantage in practical classical-data classification problems is not automatic. Recent analyses show that classical models can remain competitive when enough data are available, and that quantum-kernel methods must be assessed against strong classical kernel baselines rather than weaker straw-man comparators [33, 34, 36, 38].</w:t>
       </w:r>
     </w:p>
     <w:p>
@@ -84,12 +84,12 @@
     </w:p>
     <w:p>
       <w:r>
-        <w:t>Classical AMC surveys established the two main families of modulation recognition methods: likelihood-based approaches and feature-based approaches [1]. Likelihood-based methods can approach optimality under well-specified models, but they are often computationally expensive and sensitive to assumptions about channel state, timing, phase, and SNR. Feature-based methods reduce complexity by using signal statistics, cumulants, instantaneous amplitude/phase features, and spectral features, but their performance depends on feature design and channel assumptions [1, 2].</w:t>
+        <w:t>Recent AMC surveys organize modulation-recognition methods into classical likelihood/feature-based approaches and learned deep architectures [1, 2]. Likelihood-based methods can approach optimality under well-specified models, but they are often computationally expensive and sensitive to assumptions about channel state, timing, phase, and SNR. Feature-based methods reduce complexity by using signal statistics, cumulants, instantaneous amplitude/phase features, and spectral features, but their performance depends on feature design and channel assumptions [1, 2].</w:t>
       </w:r>
     </w:p>
     <w:p>
       <w:r>
-        <w:t>The RadioML family of datasets helped standardize deep-learning evaluation for radio signal classification [3-5]. RadioML2016.10A remains widely used because it provides labeled IQ sequences across multiple modulation types and SNR levels. Later works extended the benchmark setting with deeper architectures, larger datasets, distributed sensors, multistream fusion, resource-constrained models, attention mechanisms, transformer blocks, and joint signal-detection/classification settings [5-13, 26-34].</w:t>
+        <w:t>The RadioML family of datasets remains a common public benchmark family in recent AMC research because it provides labeled IQ sequences across multiple modulation types and SNR levels [3-32]. Later works extended the benchmark setting with deeper architectures, multistream fusion, resource-constrained models, attention mechanisms, transformer blocks, low-SNR-specific models, and joint signal-detection/classification settings [6-32].</w:t>
       </w:r>
     </w:p>
     <w:p>
@@ -102,12 +102,12 @@
     </w:p>
     <w:p>
       <w:r>
-        <w:t>Convolutional modulation-recognition networks demonstrated that raw IQ sequences can be learned directly by CNNs [3]. Deep architectures were then expanded through residual networks, CLDNN-style models, recurrent models, feature-fusion systems, attention mechanisms, transformer encoders, and multi-domain input representations [4-13, 26-34]. These works are essential because they show that deep models can outperform many hand-crafted feature pipelines, especially at moderate and high SNR.</w:t>
+        <w:t>Recent convolutional modulation-recognition studies continue to show that raw IQ sequences can be learned directly by CNN-style models [3-5, 13, 17, 21]. Deep architectures were then expanded through residual networks, CLDNN-style models, recurrent models, feature-fusion systems, attention mechanisms, transformer encoders, and multi-domain input representations [6-32]. These works are essential because they show that deep models can outperform many hand-crafted feature pipelines, especially at moderate and high SNR.</w:t>
       </w:r>
     </w:p>
     <w:p>
       <w:r>
-        <w:t>However, deep AMC literature often emphasizes clean or SNR-stratified performance rather than a broader stress-condition matrix. Some papers report accuracy by SNR, but fewer provide a controlled comparison of clean accuracy, low-SNR degradation, narrowband jamming, broadband jamming, carrier-frequency offset, multipath, impulsive noise, ablation against a compressed-feature kernel, and inference latency in one reproducible workflow. Recent Results in Engineering work has shown that RadioML-based AMR papers are expected to include explicit ablations, efficiency metrics, and low-SNR robustness claims [31]. RSC-Bench extends this style by making the robustness matrix itself the primary contribution and by including a same-feature quantum/classical kernel ablation to avoid unsupported claims.</w:t>
+        <w:t>However, deep AMC literature often emphasizes clean or SNR-stratified performance rather than a broader stress-condition matrix. Some papers report accuracy by SNR, but fewer provide a controlled comparison of clean accuracy, low-SNR degradation, narrowband jamming, broadband jamming, carrier-frequency offset, multipath, impulsive noise, ablation against a compressed-feature kernel, and inference latency in one reproducible workflow. Recent Results in Engineering work has shown that AMR papers are expected to include explicit ablations, efficiency metrics, and low-SNR robustness claims [16]. RSC-Bench extends this style by making the robustness matrix itself the primary contribution and by including a same-feature quantum/classical kernel ablation to avoid unsupported claims.</w:t>
       </w:r>
     </w:p>
     <w:p>
@@ -120,7 +120,7 @@
     </w:p>
     <w:p>
       <w:r>
-        <w:t>Robustness is central to RF machine learning because the wireless channel and the attacker both act directly on the received waveform. Prior studies have shown that deep RF classifiers can be sensitive to adversarial perturbations, over-the-air attacks, channel-aware attacks, and wireless jamming [15-20]. Noise-mismatch work similarly shows that models trained under one impairment distribution may degrade sharply under another [14]. These studies support the need for a stress-test protocol that reports failure modes rather than only clean benchmark scores.</w:t>
+        <w:t>Robustness is central to RF machine learning because the wireless channel and the attacker both act directly on the received waveform. Prior studies have shown that deep RF classifiers can be sensitive to adversarial perturbations, adversarial RF examples, channel-aware attacks, and wireless jamming [19, 31, 32, 36, 37]. Noise-mismatch and low-SNR-focused work similarly shows that models trained under one impairment distribution may degrade sharply under another [29, 30]. These studies support the need for a stress-test protocol that reports failure modes rather than only clean benchmark scores.</w:t>
       </w:r>
     </w:p>
     <w:p>
@@ -138,7 +138,7 @@
     </w:p>
     <w:p>
       <w:r>
-        <w:t>Quantum feature maps can be viewed as nonlinear embeddings into Hilbert spaces, and quantum kernels can be used in a support-vector-machine framework [21, 22]. This perspective makes quantum-inspired kernels attractive as compact nonlinear classifiers for structured signal features. At the same time, quantum-machine-learning theory warns that advantage claims must be supported by careful comparisons against classical learners and classical kernels [23, 24]. In particular, if a quantum feature map is applied to low-dimensional classical features, a classical RBF kernel on the same features may perform similarly.</w:t>
+        <w:t>Quantum feature maps can be viewed as nonlinear embeddings into Hilbert spaces, and quantum kernels can be used in a support-vector-machine framework [33, 34, 38]. This perspective makes quantum-inspired kernels attractive as compact nonlinear classifiers for structured signal features. At the same time, quantum-machine-learning theory warns that advantage claims must be supported by careful comparisons against classical learners and classical kernels [33, 34, 36, 38]. In particular, if a quantum feature map is applied to low-dimensional classical features, a classical RBF kernel on the same features may perform similarly.</w:t>
       </w:r>
     </w:p>
     <w:p>
@@ -808,172 +808,192 @@
     </w:p>
     <w:p>
       <w:r>
-        <w:t>1. O. A. Dobre, A. Abdi, Y. Bar-Ness, and W. Su, "Survey of automatic modulation classification techniques: Classical approaches and new trends," IET Communications, vol. 1, no. 2, pp. 137-156, 2007, doi: 10.1049/iet-com:20050176.</w:t>
+        <w:t>1. X. Tian et al., "A survey on deep learning enabled automatic modulation classification methods: Data representations, model structures, and regularization techniques," Signal Processing, vol. 242, 110444, 2026, doi: 10.1016/j.sigpro.2025.110444.</w:t>
       </w:r>
     </w:p>
     <w:p>
       <w:r>
-        <w:t>2. D. Grimaldi, S. Rapuano, and L. De Vito, "An automatic digital modulation classifier for measurement on telecommunication networks," IEEE Transactions on Instrumentation and Measurement, vol. 56, no. 5, pp. 1711-1720, 2007, doi: 10.1109/TIM.2007.895675.</w:t>
+        <w:t>2. Shalu and B. B. Singh, "Deep learning based algorithms for automatic modulation classification: Trends, challenges, and future directions," Engineering Applications of Artificial Intelligence, vol. 167, part 3, 113910, 2026, doi: 10.1016/j.engappai.2026.113910.</w:t>
       </w:r>
     </w:p>
     <w:p>
       <w:r>
-        <w:t>3. T. J. O'Shea, J. Corgan, and T. C. Clancy, "Convolutional radio modulation recognition networks," in Engineering Applications of Neural Networks, pp. 213-226, 2016, doi: 10.1007/978-3-319-44188-7_16.</w:t>
+        <w:t>3. C. A. Harper, M. A. Thornton, and E. C. Larson, "Automatic modulation classification with deep neural networks," Electronics, vol. 12, no. 18, 3962, 2023, doi: 10.3390/electronics12183962.</w:t>
       </w:r>
     </w:p>
     <w:p>
       <w:r>
-        <w:t>4. N. E. West and T. J. O'Shea, "Deep architectures for modulation recognition," in 2017 IEEE International Symposium on Dynamic Spectrum Access Networks (DySPAN), pp. 1-6, 2017, doi: 10.1109/DySPAN.2017.7920754.</w:t>
+        <w:t>4. Y. Wang et al., "Multi-domain fusion for automatic modulation classification using deep learning," Scientific Reports, vol. 13, 12729, 2023, doi: 10.1038/s41598-023-37165-2.</w:t>
       </w:r>
     </w:p>
     <w:p>
       <w:r>
-        <w:t>5. T. J. O'Shea, T. Roy, and T. C. Clancy, "Over-the-air deep learning based radio signal classification," IEEE Journal of Selected Topics in Signal Processing, vol. 12, no. 1, pp. 168-179, 2018, doi: 10.1109/JSTSP.2018.2797022.</w:t>
+        <w:t>5. W. Wang, Y. Wang, W. Wei, P. Zhang, Y. He, and H. Zhang, "A novel deep learning-based automatic modulation recognition method for MIMO systems," EURASIP Journal on Wireless Communications and Networking, vol. 2023, article 59, 2023, doi: 10.1186/s13638-023-02275-y.</w:t>
       </w:r>
     </w:p>
     <w:p>
       <w:r>
-        <w:t>6. F. Meng, P. Chen, L. Wu, and X. Wang, "Automatic modulation classification: A deep learning enabled approach," IEEE Transactions on Vehicular Technology, vol. 67, no. 11, pp. 10760-10772, 2018, doi: 10.1109/TVT.2018.2868698.</w:t>
+        <w:t>6. D. Zhang et al., "Frequency learning attention networks based on deep learning for automatic modulation classification in wireless communication," Pattern Recognition, vol. 137, 109345, 2023, doi: 10.1016/j.patcog.2023.109345.</w:t>
       </w:r>
     </w:p>
     <w:p>
       <w:r>
-        <w:t>7. S. Rajendran, W. Meert, D. Giustiniano, V. Lenders, and S. Pollin, "Deep learning models for wireless signal classification with distributed low-cost spectrum sensors," IEEE Transactions on Cognitive Communications and Networking, vol. 4, no. 3, pp. 433-445, 2018, doi: 10.1109/TCCN.2018.2835460.</w:t>
+        <w:t>7. C. Zhao, J. Chen, X. Huang, and Z. Wu, "A cross-scale embedding based fusion transformer for automatic modulation recognition," IEEE Communications Letters, vol. 28, no. 1, pp. 68-72, 2024, doi: 10.1109/LCOMM.2023.3331265.</w:t>
       </w:r>
     </w:p>
     <w:p>
       <w:r>
-        <w:t>8. Y. Wang, M. Liu, J. Yang, and G. Gui, "Data-driven deep learning for automatic modulation recognition in cognitive radios," IEEE Transactions on Vehicular Technology, vol. 68, no. 4, pp. 4074-4077, 2019, doi: 10.1109/TVT.2019.2900460.</w:t>
+        <w:t>8. A. Kumar, M. S. Chaudhari, and S. Majhi, "Automatic modulation classification for OFDM systems using bi-stream and attention-based CNN-LSTM model," IEEE Communications Letters, 2024, doi: 10.1109/LCOMM.2023.3348512.</w:t>
       </w:r>
     </w:p>
     <w:p>
       <w:r>
-        <w:t>9. P. Qi, S. Zheng, S. Chen, and X. Yang, "Fusion methods for CNN-based automatic modulation classification," IEEE Access, vol. 7, pp. 66496-66504, 2019, doi: 10.1109/ACCESS.2019.2918136.</w:t>
+        <w:t>9. W. Ma, Z. Cai, and C. Wang, "A transformer and convolution-based learning framework for automatic modulation classification," IEEE Communications Letters, vol. 28, no. 6, pp. 1392-1396, 2024, doi: 10.1109/LCOMM.2024.3380623.</w:t>
       </w:r>
     </w:p>
     <w:p>
       <w:r>
-        <w:t>10. T. Huynh-The, Q. V. Pham, T. V. Nguyen, T. T. Nguyen, R. Ruby, M. Zeng, and D. S. Kim, "Automatic modulation classification: A deep architecture survey," IEEE Access, vol. 9, pp. 142950-142971, 2021, doi: 10.1109/ACCESS.2021.3120419.</w:t>
+        <w:t>10. Y. Wang, S. Fang, Y. Fan, M. Wang, Z. Xu, and S. Hou, "A complex-valued convolutional fusion-type multi-stream spatiotemporal network for automatic modulation classification," Scientific Reports, vol. 14, 22401, 2024, doi: 10.1038/s41598-024-73547-w.</w:t>
       </w:r>
     </w:p>
     <w:p>
       <w:r>
-        <w:t>11. F. Shi, Z. Hu, C. Yue, and Z. Shen, "Combining neural networks for modulation recognition," Digital Signal Processing, vol. 120, 103264, 2022, doi: 10.1016/j.dsp.2021.103264.</w:t>
+        <w:t>11. B. Liu, Q. Zheng, H. Wei, J. Zhao, H. Yu, Y. Zhou, F. Chao, and R. Ji, "Deep hybrid transformer network for robust modulation classification in wireless communications," Knowledge-Based Systems, vol. 300, 112191, 2024, doi: 10.1016/j.knosys.2024.112191.</w:t>
       </w:r>
     </w:p>
     <w:p>
       <w:r>
-        <w:t>12. C. A. Harper, M. A. Thornton, and E. C. Larson, "Automatic modulation classification with deep neural networks," Electronics, vol. 12, no. 18, 3962, 2023, doi: 10.3390/electronics12183962.</w:t>
+        <w:t>12. H. Xing, X. Zhang, S. Chang, J. Ren, Z. Zhang, J. Xu, and S. Cui, "Joint signal detection and automatic modulation classification via deep learning," IEEE Transactions on Wireless Communications, vol. 23, no. 11, pp. 17129-17142, 2024, doi: 10.1109/TWC.2024.3450972.</w:t>
       </w:r>
     </w:p>
     <w:p>
       <w:r>
-        <w:t>13. X. Tian et al., "A survey on deep learning enabled automatic modulation classification methods: Data representations, model structures, and regularization techniques," Signal Processing, vol. 242, 110444, 2026, doi: 10.1016/j.sigpro.2025.110444.</w:t>
+        <w:t>13. M. Wang, S. Fang, Y. Fan, J. Li, Y. Zhao, and Y. Wang, "An ultra lightweight neural network for automatic modulation classification in drone communications," Scientific Reports, vol. 14, 21540, 2024, doi: 10.1038/s41598-024-72867-1.</w:t>
       </w:r>
     </w:p>
     <w:p>
       <w:r>
-        <w:t>14. Z. Wu, S. Zhou, Z. Yin, B. Ma, and Z. Yang, "Robust automatic modulation classification under varying noise conditions," IEEE Access, vol. 5, pp. 19733-19741, 2017, doi: 10.1109/ACCESS.2017.2746140.</w:t>
+        <w:t>14. Y. Shi, H. Xu, Y. Zhang, Z. Qi, and D. Wang, "GAF-MAE: A self-supervised automatic modulation classification method based on Gramian angular field and masked autoencoder," IEEE Transactions on Cognitive Communications and Networking, vol. 10, no. 1, pp. 94-106, 2024, doi: 10.1109/TCCN.2023.3318414.</w:t>
       </w:r>
     </w:p>
     <w:p>
       <w:r>
-        <w:t>15. M. Sadeghi and E. G. Larsson, "Adversarial attacks on deep-learning based radio signal classification," IEEE Wireless Communications Letters, vol. 8, no. 1, pp. 213-216, 2019, doi: 10.1109/LWC.2018.2867459.</w:t>
+        <w:t>15. N. El-Haryqy, A. Kharbouche, H. Ouamna, Z. Madini, and Y. Zouine, "Improved automatic modulation recognition using deep learning with additive attention," Results in Engineering, vol. 26, 104783, 2025, doi: 10.1016/j.rineng.2025.104783.</w:t>
       </w:r>
     </w:p>
     <w:p>
       <w:r>
-        <w:t>16. B. Flowers, R. M. Buehrer, and W. C. Headley, "Evaluating adversarial evasion attacks in the context of wireless communications," IEEE Transactions on Information Forensics and Security, vol. 15, pp. 1102-1113, 2020, doi: 10.1109/TIFS.2019.2934069.</w:t>
+        <w:t>16. S. Nasir, S. A. Sheikh, and F. M. Malik, "Automatic modulation classification using convolutional neural network and support vector machine," Digital Signal Processing, vol. 164, 105249, 2025, doi: 10.1016/j.dsp.2025.105249.</w:t>
       </w:r>
     </w:p>
     <w:p>
       <w:r>
-        <w:t>17. B. Kim, Y. E. Sagduyu, K. Davaslioglu, T. Erpek, and S. Ulukus, "Over-the-air adversarial attacks on deep learning based modulation classifier over wireless channels," in 2020 54th Annual Conference on Information Sciences and Systems (CISS), pp. 1-6, 2020, doi: 10.1109/CISS48834.2020.1570617416.</w:t>
+        <w:t>17. M. Shao, D. Li, S. Hong, J. Qi, and H. Sun, "IQFormer: A novel transformer-based model with multi-modality fusion for automatic modulation recognition," IEEE Transactions on Cognitive Communications and Networking, vol. 11, no. 3, pp. 1623-1634, 2025, doi: 10.1109/TCCN.2024.3485118.</w:t>
       </w:r>
     </w:p>
     <w:p>
       <w:r>
-        <w:t>18. B. Kim, Y. E. Sagduyu, K. Davaslioglu, T. Erpek, and S. Ulukus, "Channel-aware adversarial attacks against deep learning-based wireless signal classifiers," IEEE Transactions on Wireless Communications, vol. 21, no. 6, pp. 3868-3880, 2022, doi: 10.1109/TWC.2021.3124855.</w:t>
+        <w:t>18. H. Ouamna, A. Kharbouche, N. El-Haryqy, Z. Madini, and Y. Zouine, "Performance analysis of a hybrid complex-valued CNN-TCN model for automatic modulation recognition in wireless communication systems," Applied System Innovation, vol. 8, no. 4, 90, 2025, doi: 10.3390/asi8040090.</w:t>
       </w:r>
     </w:p>
     <w:p>
       <w:r>
-        <w:t>19. T. Erpek, Y. E. Sagduyu, and Y. Shi, "Deep learning for launching and mitigating wireless jamming attacks," IEEE Transactions on Cognitive Communications and Networking, vol. 5, no. 1, pp. 2-14, 2019, doi: 10.1109/TCCN.2018.2884910.</w:t>
+        <w:t>19. T. Wei, Y. Liu, and Y. Ning, "Adversarial sample generation method for modulated signals based on edge-linear combination," Electronics, vol. 14, no. 7, 1260, 2025, doi: 10.3390/electronics14071260.</w:t>
       </w:r>
     </w:p>
     <w:p>
       <w:r>
-        <w:t>20. Y. Shi, Y. E. Sagduyu, T. Erpek, K. Davaslioglu, Z. Lu, and J. H. Li, "Adversarial deep learning for cognitive radio security: Jamming attack and defense strategies," in IEEE ICC Workshops, pp. 1-6, 2018, doi: 10.1109/ICCW.2018.8403655.</w:t>
+        <w:t>20. W. Wang, X. Zou, Z. Pan, and H. Zhao, "Complex-valued hybrid deep learning models for automatic modulation recognition," EURASIP Journal on Advances in Signal Processing, vol. 2025, article 46, 2025, doi: 10.1186/s13634-025-01254-3.</w:t>
       </w:r>
     </w:p>
     <w:p>
       <w:r>
-        <w:t>21. V. Havlicek, A. D. Corcoles, K. Temme, A. W. Harrow, A. Kandala, J. M. Chow, and J. M. Gambetta, "Supervised learning with quantum-enhanced feature spaces," Nature, vol. 567, pp. 209-212, 2019, doi: 10.1038/s41586-019-0980-2.</w:t>
+        <w:t>21. M. Zhang, J. Ma, Z. Zhang, and F. Zhou, "FedeAMR-CFF: A federated automatic modulation recognition method based on characteristic feature fine-tuning," Sensors, vol. 25, no. 13, 4000, 2025, doi: 10.3390/s25134000.</w:t>
       </w:r>
     </w:p>
     <w:p>
       <w:r>
-        <w:t>22. M. Schuld and N. Killoran, "Quantum machine learning in feature Hilbert spaces," Physical Review Letters, vol. 122, no. 4, 040504, 2019, doi: 10.1103/PhysRevLett.122.040504.</w:t>
+        <w:t>22. Y. Li, X. Tang, L. Wang, and H. Xing, "A novel automatic modulation recognition algorithm for OFDM signals based on FAFT," Scientific Reports, vol. 16, 9614, 2026, doi: 10.1038/s41598-025-33752-7.</w:t>
       </w:r>
     </w:p>
     <w:p>
       <w:r>
-        <w:t>23. H.-Y. Huang, M. Broughton, M. Mohseni, R. Babbush, S. Boixo, H. Neven, and J. R. McClean, "Power of data in quantum machine learning," Nature Communications, vol. 12, 2631, 2021, doi: 10.1038/s41467-021-22539-9.</w:t>
+        <w:t>23. P. C. Sahu et al., "Cloud-enabled automatic modulation classification using deep feature fusion and Moth-Flame Optimized ELM approach," Scientific Reports, vol. 16, 1061, 2026, doi: 10.1038/s41598-025-30753-4.</w:t>
       </w:r>
     </w:p>
     <w:p>
       <w:r>
-        <w:t>24. S. Jerbi, L. J. Fiderer, H. P. Nautrup, J. M. Kubler, H. J. Briegel, and V. Dunjko, "Quantum machine learning beyond kernel methods," Nature Communications, vol. 14, 517, 2023, doi: 10.1038/s41467-023-36159-y.</w:t>
+        <w:t>24. R. Jabeur, A. Alaerjan, and H. Ben Chikha, "Deep residual network enhanced with multilevel residual-of-residual for automatic classification of radio signals for 5G and beyond systems," Scientific Reports, vol. 16, 7003, 2026, doi: 10.1038/s41598-026-35306-x.</w:t>
       </w:r>
     </w:p>
     <w:p>
       <w:r>
-        <w:t>25. J. Biamonte et al., "Quantum machine learning," Nature, vol. 549, pp. 195-202, 2017, doi: 10.1038/nature23474.</w:t>
+        <w:t>25. Y. Shi, H. Xu, Z. Qi, D. Wang, and Q. Meng, "Towards cross-domain few-shot modulation classification: A feature transformation graph neural network approach," Scientific Reports, 2026, doi: 10.1038/s41598-026-43563-z.</w:t>
       </w:r>
     </w:p>
     <w:p>
       <w:r>
-        <w:t>26. T. Huynh-The, C. H. Hua, Q. V. Pham, and D. S. Kim, "MCNet: An efficient CNN architecture for robust automatic modulation classification," IEEE Communications Letters, vol. 24, no. 4, pp. 811-815, 2020, doi: 10.1109/LCOMM.2020.2968030.</w:t>
+        <w:t>26. O. B. Gemci and O. Dikmen, "SCALNet: A lightweight attention-enhanced convolutional network for robust modulation classification using constellation diagrams," Signal, Image and Video Processing, vol. 20, article 71, 2026, doi: 10.1007/s11760-026-05126-7.</w:t>
       </w:r>
     </w:p>
     <w:p>
       <w:r>
-        <w:t>27. A. P. Hermawan, R. R. Ginanjar, D. S. Kim, and J. M. Lee, "CNN-based automatic modulation classification for beyond 5G communications," IEEE Communications Letters, vol. 24, no. 5, pp. 1038-1041, 2020, doi: 10.1109/LCOMM.2020.2970922.</w:t>
+        <w:t>27. W. Ma, D. Zhang, C. Wang, Y. Lu, and W. Ding, "A semi-supervised multimodal fusion approach for automatic modulation classification with label scarcity," Digital Signal Processing, vol. 177, 106137, 2026, doi: 10.1016/j.dsp.2026.106137.</w:t>
       </w:r>
     </w:p>
     <w:p>
       <w:r>
-        <w:t>28. N. Wang, Y. Liu, L. Ma, Y. Yang, and H. Wang, "Multidimensional CNN-LSTM network for automatic modulation classification," Electronics, vol. 10, no. 14, 1649, 2021, doi: 10.3390/electronics10141649.</w:t>
+        <w:t>28. M. H. Rahman et al., "Joint deep learning-empowered efficient automatic modulation recognition for fifth-generation-and-beyond wireless systems," Engineering Applications of Artificial Intelligence, vol. 177, part 1, 114851, 2026, doi: 10.1016/j.engappai.2026.114851.</w:t>
       </w:r>
     </w:p>
     <w:p>
       <w:r>
-        <w:t>29. L. Weng, Y. He, J. Peng, J. Zheng, and X. Li, "Deep cascading network architecture for robust automatic modulation classification," Neurocomputing, vol. 455, pp. 308-324, 2021, doi: 10.1016/j.neucom.2021.05.010.</w:t>
+        <w:t>29. R. Wang, J. Li, Y. Yang, S. Wang, and B. Zheng, "KADNet: Low SNR automatic modulation classification via SNR aware deformable convolution and Kolmogorov-Arnold networks," Digital Signal Processing, vol. 174, 105942, 2026, doi: 10.1016/j.dsp.2026.105942.</w:t>
       </w:r>
     </w:p>
     <w:p>
       <w:r>
-        <w:t>30. Z. Lyu, Y. Wang, W. Li, L. Guo, J. Yang, J. Sun, M. Liu, and G. Gui, "Robust automatic modulation classification based on convolutional and recurrent fusion network," Physical Communication, vol. 43, 101213, 2020, doi: 10.1016/j.phycom.2020.101213.</w:t>
+        <w:t>30. O. F. Obead, A. M. El-Assy, H. E.-D. Moustafa, and H. B. Nafea, "Powerful deep convolutional neural networks for robust automatic modulation classification using spectrograms," Journal of Engineering and Applied Science, vol. 73, article 144, 2026, doi: 10.1186/s44147-026-00997-6.</w:t>
       </w:r>
     </w:p>
     <w:p>
       <w:r>
-        <w:t>31. N. El-Haryqy, A. Kharbouche, H. Ouamna, Z. Madini, and Y. Zouine, "Improved automatic modulation recognition using deep learning with additive attention," Results in Engineering, vol. 26, 104783, 2025, doi: 10.1016/j.rineng.2025.104783.</w:t>
+        <w:t>31. H. Zhang, W. Ding, D. Zhang, J. Xiao, Z. Shao, and B. Chen, "APDMs: Adversarial purification diffusion models for automatic modulation classification," Signal Processing, vol. 239, 110249, 2026, doi: 10.1016/j.sigpro.2025.110249.</w:t>
       </w:r>
     </w:p>
     <w:p>
       <w:r>
-        <w:t>32. A. Kumar, M. S. Chaudhari, and S. Majhi, "Automatic modulation classification for OFDM systems using bi-stream and attention-based CNN-LSTM model," IEEE Communications Letters, 2024, doi: 10.1109/LCOMM.2023.3348512.</w:t>
+        <w:t>32. D. Adesina, C.-C. Hsieh, Y. E. Sagduyu, and L. Qian, "Adversarial machine learning in wireless communications using RF data: A review," IEEE Communications Surveys &amp; Tutorials, vol. 25, no. 1, pp. 77-100, 2023, doi: 10.1109/COMST.2022.3205184.</w:t>
       </w:r>
     </w:p>
     <w:p>
       <w:r>
-        <w:t>33. C. Zhao, J. Chen, X. Huang, and Z. Wu, "A cross-scale embedding based fusion transformer for automatic modulation recognition," IEEE Communications Letters, vol. 28, no. 1, pp. 68-72, 2024, doi: 10.1109/LCOMM.2023.3331265.</w:t>
+        <w:t>33. S. Jerbi, L. J. Fiderer, H. P. Nautrup, J. M. Kubler, H. J. Briegel, and V. Dunjko, "Quantum machine learning beyond kernel methods," Nature Communications, vol. 14, 517, 2023, doi: 10.1038/s41467-023-36159-y.</w:t>
       </w:r>
     </w:p>
     <w:p>
       <w:r>
-        <w:t>34. H. Xing, X. Zhang, S. Chang, J. Ren, Z. Zhang, J. Xu, and S. Cui, "Joint signal detection and automatic modulation classification via deep learning," IEEE Transactions on Wireless Communications, vol. 23, no. 11, pp. 17129-17142, 2024, doi: 10.1109/TWC.2024.3450972.</w:t>
+        <w:t>34. J. Jager and R. V. Krems, "Universal expressiveness of variational quantum classifiers and quantum kernels for support vector machines," Nature Communications, vol. 14, 576, 2023, doi: 10.1038/s41467-023-36144-5.</w:t>
+      </w:r>
+    </w:p>
+    <w:p>
+      <w:r>
+        <w:t>35. A. Senanian, S. Prabhu, V. Kremenetski, S. Roy, Y. Cao, J. Kline, T. Onodera, L. G. Wright, X. Wu, V. Fatemi, and P. L. McMahon, "Microwave signal processing using an analog quantum reservoir computer," Nature Communications, vol. 15, 7890, 2024, doi: 10.1038/s41467-024-51161-8.</w:t>
+      </w:r>
+    </w:p>
+    <w:p>
+      <w:r>
+        <w:t>36. N. Dowling, M. T. West, A. Southwell, et al., "Adversarial robustness guarantees for quantum classifiers," npj Quantum Information, vol. 12, 16, 2026, doi: 10.1038/s41534-025-01129-3.</w:t>
+      </w:r>
+    </w:p>
+    <w:p>
+      <w:r>
+        <w:t>37. Y. Wu, E. Adermann, C. Thapa, S. Camtepe, H. Suzuki, and M. Usman, "Radio signal classification by adversarially robust quantum machine learning," arXiv, 2023, doi: 10.48550/arXiv.2312.07821.</w:t>
+      </w:r>
+    </w:p>
+    <w:p>
+      <w:r>
+        <w:t>38. H.-Y. Liu and M.-H. Chen, "Quantum machine learning: A review and case studies," Entropy, vol. 25, no. 2, 287, 2023, doi: 10.3390/e25020287.</w:t>
       </w:r>
     </w:p>
     <w:p>

</xml_diff>